<commit_message>
No Word tables, part 2: A Trip Is Not a New Life (6 text, 1 image), The Universe Has No Now (2 text; spec tables on), Gravitation, Actually (1 text, 3 number tables as images), Quantum Vol 1 (19 boxes as text)
</commit_message>
<xml_diff>
--- a/Gravitation, Actually/Gravitation, Actually - Rev8.docx
+++ b/Gravitation, Actually/Gravitation, Actually - Rev8.docx
@@ -14897,937 +14897,48 @@
         <w:t>Worked row, 0.6c. The factor is 1/√(1 − 0.36) = 1/0.8 = 1.25. Two speeds of 0.6c combine to (0.6 + 0.6)/(1 + 0.36) = 0.882c. For a traveler at 0.6c covering 0.6 light-seconds in 1 second, the interval squared is −1 + 0.36 = −0.64 (light-seconds squared): negative, so timelike, and the traveler’s clock reads √0.64 = 0.8 s.</w:t>
       </w:r>
     </w:p>
-    <w:tbl>
-      <w:tblPr>
-        <w:tblStyle w:val="TableGrid"/>
-        <w:tblW w:type="auto" w:w="0"/>
-        <w:tblLook w:firstColumn="1" w:firstRow="1" w:lastColumn="0" w:lastRow="0" w:noHBand="0" w:noVBand="1" w:val="04A0"/>
-      </w:tblPr>
-      <w:tblGrid>
-        <w:gridCol w:w="2340"/>
-        <w:gridCol w:w="2340"/>
-        <w:gridCol w:w="2340"/>
-        <w:gridCol w:w="2340"/>
-      </w:tblGrid>
-      <w:tr>
-        <w:tc>
-          <w:tcPr>
-            <w:tcW w:type="dxa" w:w="2340"/>
-            <w:shd w:val="clear" w:color="auto" w:fill="DCE6F0"/>
-          </w:tcPr>
-          <w:p>
-            <w:pPr>
-              <w:spacing w:after="0"/>
-            </w:pPr>
-            <w:r/>
-            <w:r>
-              <w:rPr>
-                <w:b/>
-                <w:sz w:val="19"/>
-              </w:rPr>
-              <w:t>Speed (fraction of c)</w:t>
-            </w:r>
-          </w:p>
-        </w:tc>
-        <w:tc>
-          <w:tcPr>
-            <w:tcW w:type="dxa" w:w="2340"/>
-            <w:shd w:val="clear" w:color="auto" w:fill="DCE6F0"/>
-          </w:tcPr>
-          <w:p>
-            <w:pPr>
-              <w:spacing w:after="0"/>
-            </w:pPr>
-            <w:r/>
-            <w:r>
-              <w:rPr>
-                <w:b/>
-                <w:sz w:val="19"/>
-              </w:rPr>
-              <w:t>Time factor</w:t>
-            </w:r>
-          </w:p>
-        </w:tc>
-        <w:tc>
-          <w:tcPr>
-            <w:tcW w:type="dxa" w:w="2340"/>
-            <w:shd w:val="clear" w:color="auto" w:fill="DCE6F0"/>
-          </w:tcPr>
-          <w:p>
-            <w:pPr>
-              <w:spacing w:after="0"/>
-            </w:pPr>
-            <w:r/>
-            <w:r>
-              <w:rPr>
-                <w:b/>
-                <w:sz w:val="19"/>
-              </w:rPr>
-              <w:t>Same speed added twice</w:t>
-            </w:r>
-          </w:p>
-        </w:tc>
-        <w:tc>
-          <w:tcPr>
-            <w:tcW w:type="dxa" w:w="2340"/>
-            <w:shd w:val="clear" w:color="auto" w:fill="DCE6F0"/>
-          </w:tcPr>
-          <w:p>
-            <w:pPr>
-              <w:spacing w:after="0"/>
-            </w:pPr>
-            <w:r/>
-            <w:r>
-              <w:rPr>
-                <w:b/>
-                <w:sz w:val="19"/>
-              </w:rPr>
-              <w:t>Interval² for 1 s of travel</w:t>
-            </w:r>
-          </w:p>
-        </w:tc>
-      </w:tr>
-      <w:tr>
-        <w:tc>
-          <w:tcPr>
-            <w:tcW w:type="dxa" w:w="2340"/>
-          </w:tcPr>
-          <w:p>
-            <w:pPr>
-              <w:spacing w:after="0"/>
-            </w:pPr>
-            <w:r/>
-            <w:r>
-              <w:rPr>
-                <w:sz w:val="19"/>
-              </w:rPr>
-              <w:t>0.1</w:t>
-            </w:r>
-          </w:p>
-        </w:tc>
-        <w:tc>
-          <w:tcPr>
-            <w:tcW w:type="dxa" w:w="2340"/>
-          </w:tcPr>
-          <w:p>
-            <w:pPr>
-              <w:spacing w:after="0"/>
-            </w:pPr>
-            <w:r/>
-            <w:r>
-              <w:rPr>
-                <w:sz w:val="19"/>
-              </w:rPr>
-              <w:t>1.005</w:t>
-            </w:r>
-          </w:p>
-        </w:tc>
-        <w:tc>
-          <w:tcPr>
-            <w:tcW w:type="dxa" w:w="2340"/>
-          </w:tcPr>
-          <w:p>
-            <w:pPr>
-              <w:spacing w:after="0"/>
-            </w:pPr>
-            <w:r/>
-            <w:r>
-              <w:rPr>
-                <w:sz w:val="19"/>
-              </w:rPr>
-              <w:t>0.198</w:t>
-            </w:r>
-          </w:p>
-        </w:tc>
-        <w:tc>
-          <w:tcPr>
-            <w:tcW w:type="dxa" w:w="2340"/>
-          </w:tcPr>
-          <w:p>
-            <w:pPr>
-              <w:spacing w:after="0"/>
-            </w:pPr>
-            <w:r/>
-            <w:r>
-              <w:rPr>
-                <w:sz w:val="19"/>
-              </w:rPr>
-              <w:t>−0.99</w:t>
-            </w:r>
-          </w:p>
-        </w:tc>
-      </w:tr>
-      <w:tr>
-        <w:tc>
-          <w:tcPr>
-            <w:tcW w:type="dxa" w:w="2340"/>
-          </w:tcPr>
-          <w:p>
-            <w:pPr>
-              <w:spacing w:after="0"/>
-            </w:pPr>
-            <w:r/>
-            <w:r>
-              <w:rPr>
-                <w:sz w:val="19"/>
-              </w:rPr>
-              <w:t>0.2</w:t>
-            </w:r>
-          </w:p>
-        </w:tc>
-        <w:tc>
-          <w:tcPr>
-            <w:tcW w:type="dxa" w:w="2340"/>
-          </w:tcPr>
-          <w:p>
-            <w:pPr>
-              <w:spacing w:after="0"/>
-            </w:pPr>
-            <w:r/>
-            <w:r>
-              <w:rPr>
-                <w:sz w:val="19"/>
-              </w:rPr>
-              <w:t>1.021</w:t>
-            </w:r>
-          </w:p>
-        </w:tc>
-        <w:tc>
-          <w:tcPr>
-            <w:tcW w:type="dxa" w:w="2340"/>
-          </w:tcPr>
-          <w:p>
-            <w:pPr>
-              <w:spacing w:after="0"/>
-            </w:pPr>
-            <w:r/>
-            <w:r>
-              <w:rPr>
-                <w:sz w:val="19"/>
-              </w:rPr>
-              <w:t>0.385</w:t>
-            </w:r>
-          </w:p>
-        </w:tc>
-        <w:tc>
-          <w:tcPr>
-            <w:tcW w:type="dxa" w:w="2340"/>
-          </w:tcPr>
-          <w:p>
-            <w:pPr>
-              <w:spacing w:after="0"/>
-            </w:pPr>
-            <w:r/>
-            <w:r>
-              <w:rPr>
-                <w:sz w:val="19"/>
-              </w:rPr>
-              <w:t>−0.96</w:t>
-            </w:r>
-          </w:p>
-        </w:tc>
-      </w:tr>
-      <w:tr>
-        <w:tc>
-          <w:tcPr>
-            <w:tcW w:type="dxa" w:w="2340"/>
-          </w:tcPr>
-          <w:p>
-            <w:pPr>
-              <w:spacing w:after="0"/>
-            </w:pPr>
-            <w:r/>
-            <w:r>
-              <w:rPr>
-                <w:sz w:val="19"/>
-              </w:rPr>
-              <w:t>0.3</w:t>
-            </w:r>
-          </w:p>
-        </w:tc>
-        <w:tc>
-          <w:tcPr>
-            <w:tcW w:type="dxa" w:w="2340"/>
-          </w:tcPr>
-          <w:p>
-            <w:pPr>
-              <w:spacing w:after="0"/>
-            </w:pPr>
-            <w:r/>
-            <w:r>
-              <w:rPr>
-                <w:sz w:val="19"/>
-              </w:rPr>
-              <w:t>1.048</w:t>
-            </w:r>
-          </w:p>
-        </w:tc>
-        <w:tc>
-          <w:tcPr>
-            <w:tcW w:type="dxa" w:w="2340"/>
-          </w:tcPr>
-          <w:p>
-            <w:pPr>
-              <w:spacing w:after="0"/>
-            </w:pPr>
-            <w:r/>
-            <w:r>
-              <w:rPr>
-                <w:sz w:val="19"/>
-              </w:rPr>
-              <w:t>0.550</w:t>
-            </w:r>
-          </w:p>
-        </w:tc>
-        <w:tc>
-          <w:tcPr>
-            <w:tcW w:type="dxa" w:w="2340"/>
-          </w:tcPr>
-          <w:p>
-            <w:pPr>
-              <w:spacing w:after="0"/>
-            </w:pPr>
-            <w:r/>
-            <w:r>
-              <w:rPr>
-                <w:sz w:val="19"/>
-              </w:rPr>
-              <w:t>−0.91</w:t>
-            </w:r>
-          </w:p>
-        </w:tc>
-      </w:tr>
-      <w:tr>
-        <w:tc>
-          <w:tcPr>
-            <w:tcW w:type="dxa" w:w="2340"/>
-          </w:tcPr>
-          <w:p>
-            <w:pPr>
-              <w:spacing w:after="0"/>
-            </w:pPr>
-            <w:r/>
-            <w:r>
-              <w:rPr>
-                <w:sz w:val="19"/>
-              </w:rPr>
-              <w:t>0.4</w:t>
-            </w:r>
-          </w:p>
-        </w:tc>
-        <w:tc>
-          <w:tcPr>
-            <w:tcW w:type="dxa" w:w="2340"/>
-          </w:tcPr>
-          <w:p>
-            <w:pPr>
-              <w:spacing w:after="0"/>
-            </w:pPr>
-            <w:r/>
-            <w:r>
-              <w:rPr>
-                <w:sz w:val="19"/>
-              </w:rPr>
-              <w:t>1.091</w:t>
-            </w:r>
-          </w:p>
-        </w:tc>
-        <w:tc>
-          <w:tcPr>
-            <w:tcW w:type="dxa" w:w="2340"/>
-          </w:tcPr>
-          <w:p>
-            <w:pPr>
-              <w:spacing w:after="0"/>
-            </w:pPr>
-            <w:r/>
-            <w:r>
-              <w:rPr>
-                <w:sz w:val="19"/>
-              </w:rPr>
-              <w:t>0.690</w:t>
-            </w:r>
-          </w:p>
-        </w:tc>
-        <w:tc>
-          <w:tcPr>
-            <w:tcW w:type="dxa" w:w="2340"/>
-          </w:tcPr>
-          <w:p>
-            <w:pPr>
-              <w:spacing w:after="0"/>
-            </w:pPr>
-            <w:r/>
-            <w:r>
-              <w:rPr>
-                <w:sz w:val="19"/>
-              </w:rPr>
-              <w:t>−0.84</w:t>
-            </w:r>
-          </w:p>
-        </w:tc>
-      </w:tr>
-      <w:tr>
-        <w:tc>
-          <w:tcPr>
-            <w:tcW w:type="dxa" w:w="2340"/>
-          </w:tcPr>
-          <w:p>
-            <w:pPr>
-              <w:spacing w:after="0"/>
-            </w:pPr>
-            <w:r/>
-            <w:r>
-              <w:rPr>
-                <w:sz w:val="19"/>
-              </w:rPr>
-              <w:t>0.5</w:t>
-            </w:r>
-          </w:p>
-        </w:tc>
-        <w:tc>
-          <w:tcPr>
-            <w:tcW w:type="dxa" w:w="2340"/>
-          </w:tcPr>
-          <w:p>
-            <w:pPr>
-              <w:spacing w:after="0"/>
-            </w:pPr>
-            <w:r/>
-            <w:r>
-              <w:rPr>
-                <w:sz w:val="19"/>
-              </w:rPr>
-              <w:t>1.155</w:t>
-            </w:r>
-          </w:p>
-        </w:tc>
-        <w:tc>
-          <w:tcPr>
-            <w:tcW w:type="dxa" w:w="2340"/>
-          </w:tcPr>
-          <w:p>
-            <w:pPr>
-              <w:spacing w:after="0"/>
-            </w:pPr>
-            <w:r/>
-            <w:r>
-              <w:rPr>
-                <w:sz w:val="19"/>
-              </w:rPr>
-              <w:t>0.800</w:t>
-            </w:r>
-          </w:p>
-        </w:tc>
-        <w:tc>
-          <w:tcPr>
-            <w:tcW w:type="dxa" w:w="2340"/>
-          </w:tcPr>
-          <w:p>
-            <w:pPr>
-              <w:spacing w:after="0"/>
-            </w:pPr>
-            <w:r/>
-            <w:r>
-              <w:rPr>
-                <w:sz w:val="19"/>
-              </w:rPr>
-              <w:t>−0.75</w:t>
-            </w:r>
-          </w:p>
-        </w:tc>
-      </w:tr>
-      <w:tr>
-        <w:tc>
-          <w:tcPr>
-            <w:tcW w:type="dxa" w:w="2340"/>
-          </w:tcPr>
-          <w:p>
-            <w:pPr>
-              <w:spacing w:after="0"/>
-            </w:pPr>
-            <w:r/>
-            <w:r>
-              <w:rPr>
-                <w:sz w:val="19"/>
-              </w:rPr>
-              <w:t>0.6</w:t>
-            </w:r>
-          </w:p>
-        </w:tc>
-        <w:tc>
-          <w:tcPr>
-            <w:tcW w:type="dxa" w:w="2340"/>
-          </w:tcPr>
-          <w:p>
-            <w:pPr>
-              <w:spacing w:after="0"/>
-            </w:pPr>
-            <w:r/>
-            <w:r>
-              <w:rPr>
-                <w:sz w:val="19"/>
-              </w:rPr>
-              <w:t>1.250</w:t>
-            </w:r>
-          </w:p>
-        </w:tc>
-        <w:tc>
-          <w:tcPr>
-            <w:tcW w:type="dxa" w:w="2340"/>
-          </w:tcPr>
-          <w:p>
-            <w:pPr>
-              <w:spacing w:after="0"/>
-            </w:pPr>
-            <w:r/>
-            <w:r>
-              <w:rPr>
-                <w:sz w:val="19"/>
-              </w:rPr>
-              <w:t>0.882</w:t>
-            </w:r>
-          </w:p>
-        </w:tc>
-        <w:tc>
-          <w:tcPr>
-            <w:tcW w:type="dxa" w:w="2340"/>
-          </w:tcPr>
-          <w:p>
-            <w:pPr>
-              <w:spacing w:after="0"/>
-            </w:pPr>
-            <w:r/>
-            <w:r>
-              <w:rPr>
-                <w:sz w:val="19"/>
-              </w:rPr>
-              <w:t>−0.64</w:t>
-            </w:r>
-          </w:p>
-        </w:tc>
-      </w:tr>
-      <w:tr>
-        <w:tc>
-          <w:tcPr>
-            <w:tcW w:type="dxa" w:w="2340"/>
-          </w:tcPr>
-          <w:p>
-            <w:pPr>
-              <w:spacing w:after="0"/>
-            </w:pPr>
-            <w:r/>
-            <w:r>
-              <w:rPr>
-                <w:sz w:val="19"/>
-              </w:rPr>
-              <w:t>0.7</w:t>
-            </w:r>
-          </w:p>
-        </w:tc>
-        <w:tc>
-          <w:tcPr>
-            <w:tcW w:type="dxa" w:w="2340"/>
-          </w:tcPr>
-          <w:p>
-            <w:pPr>
-              <w:spacing w:after="0"/>
-            </w:pPr>
-            <w:r/>
-            <w:r>
-              <w:rPr>
-                <w:sz w:val="19"/>
-              </w:rPr>
-              <w:t>1.400</w:t>
-            </w:r>
-          </w:p>
-        </w:tc>
-        <w:tc>
-          <w:tcPr>
-            <w:tcW w:type="dxa" w:w="2340"/>
-          </w:tcPr>
-          <w:p>
-            <w:pPr>
-              <w:spacing w:after="0"/>
-            </w:pPr>
-            <w:r/>
-            <w:r>
-              <w:rPr>
-                <w:sz w:val="19"/>
-              </w:rPr>
-              <w:t>0.940</w:t>
-            </w:r>
-          </w:p>
-        </w:tc>
-        <w:tc>
-          <w:tcPr>
-            <w:tcW w:type="dxa" w:w="2340"/>
-          </w:tcPr>
-          <w:p>
-            <w:pPr>
-              <w:spacing w:after="0"/>
-            </w:pPr>
-            <w:r/>
-            <w:r>
-              <w:rPr>
-                <w:sz w:val="19"/>
-              </w:rPr>
-              <w:t>−0.51</w:t>
-            </w:r>
-          </w:p>
-        </w:tc>
-      </w:tr>
-      <w:tr>
-        <w:tc>
-          <w:tcPr>
-            <w:tcW w:type="dxa" w:w="2340"/>
-          </w:tcPr>
-          <w:p>
-            <w:pPr>
-              <w:spacing w:after="0"/>
-            </w:pPr>
-            <w:r/>
-            <w:r>
-              <w:rPr>
-                <w:sz w:val="19"/>
-              </w:rPr>
-              <w:t>0.8</w:t>
-            </w:r>
-          </w:p>
-        </w:tc>
-        <w:tc>
-          <w:tcPr>
-            <w:tcW w:type="dxa" w:w="2340"/>
-          </w:tcPr>
-          <w:p>
-            <w:pPr>
-              <w:spacing w:after="0"/>
-            </w:pPr>
-            <w:r/>
-            <w:r>
-              <w:rPr>
-                <w:sz w:val="19"/>
-              </w:rPr>
-              <w:t>1.667</w:t>
-            </w:r>
-          </w:p>
-        </w:tc>
-        <w:tc>
-          <w:tcPr>
-            <w:tcW w:type="dxa" w:w="2340"/>
-          </w:tcPr>
-          <w:p>
-            <w:pPr>
-              <w:spacing w:after="0"/>
-            </w:pPr>
-            <w:r/>
-            <w:r>
-              <w:rPr>
-                <w:sz w:val="19"/>
-              </w:rPr>
-              <w:t>0.976</w:t>
-            </w:r>
-          </w:p>
-        </w:tc>
-        <w:tc>
-          <w:tcPr>
-            <w:tcW w:type="dxa" w:w="2340"/>
-          </w:tcPr>
-          <w:p>
-            <w:pPr>
-              <w:spacing w:after="0"/>
-            </w:pPr>
-            <w:r/>
-            <w:r>
-              <w:rPr>
-                <w:sz w:val="19"/>
-              </w:rPr>
-              <w:t>−0.36</w:t>
-            </w:r>
-          </w:p>
-        </w:tc>
-      </w:tr>
-      <w:tr>
-        <w:tc>
-          <w:tcPr>
-            <w:tcW w:type="dxa" w:w="2340"/>
-          </w:tcPr>
-          <w:p>
-            <w:pPr>
-              <w:spacing w:after="0"/>
-            </w:pPr>
-            <w:r/>
-            <w:r>
-              <w:rPr>
-                <w:sz w:val="19"/>
-              </w:rPr>
-              <w:t>0.9</w:t>
-            </w:r>
-          </w:p>
-        </w:tc>
-        <w:tc>
-          <w:tcPr>
-            <w:tcW w:type="dxa" w:w="2340"/>
-          </w:tcPr>
-          <w:p>
-            <w:pPr>
-              <w:spacing w:after="0"/>
-            </w:pPr>
-            <w:r/>
-            <w:r>
-              <w:rPr>
-                <w:sz w:val="19"/>
-              </w:rPr>
-              <w:t>2.294</w:t>
-            </w:r>
-          </w:p>
-        </w:tc>
-        <w:tc>
-          <w:tcPr>
-            <w:tcW w:type="dxa" w:w="2340"/>
-          </w:tcPr>
-          <w:p>
-            <w:pPr>
-              <w:spacing w:after="0"/>
-            </w:pPr>
-            <w:r/>
-            <w:r>
-              <w:rPr>
-                <w:sz w:val="19"/>
-              </w:rPr>
-              <w:t>0.994</w:t>
-            </w:r>
-          </w:p>
-        </w:tc>
-        <w:tc>
-          <w:tcPr>
-            <w:tcW w:type="dxa" w:w="2340"/>
-          </w:tcPr>
-          <w:p>
-            <w:pPr>
-              <w:spacing w:after="0"/>
-            </w:pPr>
-            <w:r/>
-            <w:r>
-              <w:rPr>
-                <w:sz w:val="19"/>
-              </w:rPr>
-              <w:t>−0.19</w:t>
-            </w:r>
-          </w:p>
-        </w:tc>
-      </w:tr>
-      <w:tr>
-        <w:tc>
-          <w:tcPr>
-            <w:tcW w:type="dxa" w:w="2340"/>
-          </w:tcPr>
-          <w:p>
-            <w:pPr>
-              <w:spacing w:after="0"/>
-            </w:pPr>
-            <w:r/>
-            <w:r>
-              <w:rPr>
-                <w:sz w:val="19"/>
-              </w:rPr>
-              <w:t>0.95</w:t>
-            </w:r>
-          </w:p>
-        </w:tc>
-        <w:tc>
-          <w:tcPr>
-            <w:tcW w:type="dxa" w:w="2340"/>
-          </w:tcPr>
-          <w:p>
-            <w:pPr>
-              <w:spacing w:after="0"/>
-            </w:pPr>
-            <w:r/>
-            <w:r>
-              <w:rPr>
-                <w:sz w:val="19"/>
-              </w:rPr>
-              <w:t>3.203</w:t>
-            </w:r>
-          </w:p>
-        </w:tc>
-        <w:tc>
-          <w:tcPr>
-            <w:tcW w:type="dxa" w:w="2340"/>
-          </w:tcPr>
-          <w:p>
-            <w:pPr>
-              <w:spacing w:after="0"/>
-            </w:pPr>
-            <w:r/>
-            <w:r>
-              <w:rPr>
-                <w:sz w:val="19"/>
-              </w:rPr>
-              <w:t>0.9987</w:t>
-            </w:r>
-          </w:p>
-        </w:tc>
-        <w:tc>
-          <w:tcPr>
-            <w:tcW w:type="dxa" w:w="2340"/>
-          </w:tcPr>
-          <w:p>
-            <w:pPr>
-              <w:spacing w:after="0"/>
-            </w:pPr>
-            <w:r/>
-            <w:r>
-              <w:rPr>
-                <w:sz w:val="19"/>
-              </w:rPr>
-              <w:t>−0.0975</w:t>
-            </w:r>
-          </w:p>
-        </w:tc>
-      </w:tr>
-      <w:tr>
-        <w:tc>
-          <w:tcPr>
-            <w:tcW w:type="dxa" w:w="2340"/>
-          </w:tcPr>
-          <w:p>
-            <w:pPr>
-              <w:spacing w:after="0"/>
-            </w:pPr>
-            <w:r/>
-            <w:r>
-              <w:rPr>
-                <w:sz w:val="19"/>
-              </w:rPr>
-              <w:t>0.99</w:t>
-            </w:r>
-          </w:p>
-        </w:tc>
-        <w:tc>
-          <w:tcPr>
-            <w:tcW w:type="dxa" w:w="2340"/>
-          </w:tcPr>
-          <w:p>
-            <w:pPr>
-              <w:spacing w:after="0"/>
-            </w:pPr>
-            <w:r/>
-            <w:r>
-              <w:rPr>
-                <w:sz w:val="19"/>
-              </w:rPr>
-              <w:t>7.089</w:t>
-            </w:r>
-          </w:p>
-        </w:tc>
-        <w:tc>
-          <w:tcPr>
-            <w:tcW w:type="dxa" w:w="2340"/>
-          </w:tcPr>
-          <w:p>
-            <w:pPr>
-              <w:spacing w:after="0"/>
-            </w:pPr>
-            <w:r/>
-            <w:r>
-              <w:rPr>
-                <w:sz w:val="19"/>
-              </w:rPr>
-              <w:t>0.99995</w:t>
-            </w:r>
-          </w:p>
-        </w:tc>
-        <w:tc>
-          <w:tcPr>
-            <w:tcW w:type="dxa" w:w="2340"/>
-          </w:tcPr>
-          <w:p>
-            <w:pPr>
-              <w:spacing w:after="0"/>
-            </w:pPr>
-            <w:r/>
-            <w:r>
-              <w:rPr>
-                <w:sz w:val="19"/>
-              </w:rPr>
-              <w:t>−0.0199</w:t>
-            </w:r>
-          </w:p>
-        </w:tc>
-      </w:tr>
-      <w:tr>
-        <w:tc>
-          <w:tcPr>
-            <w:tcW w:type="dxa" w:w="2340"/>
-          </w:tcPr>
-          <w:p>
-            <w:pPr>
-              <w:spacing w:after="0"/>
-            </w:pPr>
-            <w:r/>
-            <w:r>
-              <w:rPr>
-                <w:sz w:val="19"/>
-              </w:rPr>
-              <w:t>0.998 (cosmic-ray muons)</w:t>
-            </w:r>
-          </w:p>
-        </w:tc>
-        <w:tc>
-          <w:tcPr>
-            <w:tcW w:type="dxa" w:w="2340"/>
-          </w:tcPr>
-          <w:p>
-            <w:pPr>
-              <w:spacing w:after="0"/>
-            </w:pPr>
-            <w:r/>
-            <w:r>
-              <w:rPr>
-                <w:sz w:val="19"/>
-              </w:rPr>
-              <w:t>15.82</w:t>
-            </w:r>
-          </w:p>
-        </w:tc>
-        <w:tc>
-          <w:tcPr>
-            <w:tcW w:type="dxa" w:w="2340"/>
-          </w:tcPr>
-          <w:p>
-            <w:pPr>
-              <w:spacing w:after="0"/>
-            </w:pPr>
-            <w:r/>
-            <w:r>
-              <w:rPr>
-                <w:sz w:val="19"/>
-              </w:rPr>
-              <w:t>0.999998</w:t>
-            </w:r>
-          </w:p>
-        </w:tc>
-        <w:tc>
-          <w:tcPr>
-            <w:tcW w:type="dxa" w:w="2340"/>
-          </w:tcPr>
-          <w:p>
-            <w:pPr>
-              <w:spacing w:after="0"/>
-            </w:pPr>
-            <w:r/>
-            <w:r>
-              <w:rPr>
-                <w:sz w:val="19"/>
-              </w:rPr>
-              <w:t>−0.0040</w:t>
-            </w:r>
-          </w:p>
-        </w:tc>
-      </w:tr>
-    </w:tbl>
+    <w:p>
+      <w:pPr>
+        <w:jc w:val="center"/>
+        <w:spacing w:before="60" w:after="120"/>
+      </w:pPr>
+      <w:r xmlns:a="http://schemas.openxmlformats.org/drawingml/2006/main" xmlns:pic="http://schemas.openxmlformats.org/drawingml/2006/picture">
+        <w:drawing>
+          <wp:inline distT="0" distB="0" distL="0" distR="0">
+            <wp:extent cx="5486400" cy="3295934"/>
+            <wp:docPr id="2016" name="Table 1" descr="Speed (fraction of c) | Time factor | Same speed added twice | Interval² for 1 s of travel. 0.1 | 1.005 | 0.198 | −0.99. 0.2 | 1.021 | 0.385 | −0.96. 0.3 | 1.048 | 0.550 | −0.91. 0.4 | 1.091 | 0.690 | −0.84. 0.5 | 1.155 | 0.800 | −0.75. 0.6 | 1.250 | 0.882 | −0.64. 0.7 | 1.400 | 0.940 | −0.51. 0.8 | 1.667 | 0.976 | −0.36. 0.9 | 2.294 | 0.994 | −0.19. 0.95 | 3.203 | 0.9987 | −0.0975. 0.99 | 7.089 | 0.99995 | −0.0199. 0.998 (cosmic-ray muons) | 15.82 | 0.999998 | −0.0040"/>
+            <wp:cNvGraphicFramePr>
+              <a:graphicFrameLocks noChangeAspect="1"/>
+            </wp:cNvGraphicFramePr>
+            <a:graphic>
+              <a:graphicData uri="http://schemas.openxmlformats.org/drawingml/2006/picture">
+                <pic:pic>
+                  <pic:nvPicPr>
+                    <pic:cNvPr id="2016" name="Table 1"/>
+                    <pic:cNvPicPr/>
+                  </pic:nvPicPr>
+                  <pic:blipFill>
+                    <a:blip r:embed="rIdTbl1"/>
+                    <a:stretch>
+                      <a:fillRect/>
+                    </a:stretch>
+                  </pic:blipFill>
+                  <pic:spPr>
+                    <a:xfrm>
+                      <a:off x="0" y="0"/>
+                      <a:ext cx="5486400" cy="3295934"/>
+                    </a:xfrm>
+                    <a:prstGeom prst="rect">
+                      <a:avLst/>
+                    </a:prstGeom>
+                  </pic:spPr>
+                </pic:pic>
+              </a:graphicData>
+            </a:graphic>
+          </wp:inline>
+        </w:drawing>
+      </w:r>
+    </w:p>
     <w:p/>
     <w:p>
       <w:pPr>
@@ -15846,552 +14957,48 @@
         <w:t>Worked row, 10 Suns. The horizon radius is 2GM/c². For one Sun, 2GM/c² = 2 × 1,477 m = 2.95 km. For ten Suns, 29.5 km. The radius grows in direct proportion to the mass.</w:t>
       </w:r>
     </w:p>
-    <w:tbl>
-      <w:tblPr>
-        <w:tblStyle w:val="TableGrid"/>
-        <w:tblW w:type="auto" w:w="0"/>
-        <w:tblLook w:firstColumn="1" w:firstRow="1" w:lastColumn="0" w:lastRow="0" w:noHBand="0" w:noVBand="1" w:val="04A0"/>
-      </w:tblPr>
-      <w:tblGrid>
-        <w:gridCol w:w="3120"/>
-        <w:gridCol w:w="3120"/>
-        <w:gridCol w:w="3120"/>
-      </w:tblGrid>
-      <w:tr>
-        <w:tc>
-          <w:tcPr>
-            <w:tcW w:type="dxa" w:w="3120"/>
-            <w:shd w:val="clear" w:color="auto" w:fill="DCE6F0"/>
-          </w:tcPr>
-          <w:p>
-            <w:pPr>
-              <w:spacing w:after="0"/>
-            </w:pPr>
-            <w:r/>
-            <w:r>
-              <w:rPr>
-                <w:b/>
-                <w:sz w:val="19"/>
-              </w:rPr>
-              <w:t>Mass (Suns)</w:t>
-            </w:r>
-          </w:p>
-        </w:tc>
-        <w:tc>
-          <w:tcPr>
-            <w:tcW w:type="dxa" w:w="3120"/>
-            <w:shd w:val="clear" w:color="auto" w:fill="DCE6F0"/>
-          </w:tcPr>
-          <w:p>
-            <w:pPr>
-              <w:spacing w:after="0"/>
-            </w:pPr>
-            <w:r/>
-            <w:r>
-              <w:rPr>
-                <w:b/>
-                <w:sz w:val="19"/>
-              </w:rPr>
-              <w:t>Horizon radius</w:t>
-            </w:r>
-          </w:p>
-        </w:tc>
-        <w:tc>
-          <w:tcPr>
-            <w:tcW w:type="dxa" w:w="3120"/>
-            <w:shd w:val="clear" w:color="auto" w:fill="DCE6F0"/>
-          </w:tcPr>
-          <w:p>
-            <w:pPr>
-              <w:spacing w:after="0"/>
-            </w:pPr>
-            <w:r/>
-            <w:r>
-              <w:rPr>
-                <w:b/>
-                <w:sz w:val="19"/>
-              </w:rPr>
-              <w:t>Example</w:t>
-            </w:r>
-          </w:p>
-        </w:tc>
-      </w:tr>
-      <w:tr>
-        <w:tc>
-          <w:tcPr>
-            <w:tcW w:type="dxa" w:w="3120"/>
-          </w:tcPr>
-          <w:p>
-            <w:pPr>
-              <w:spacing w:after="0"/>
-            </w:pPr>
-            <w:r/>
-            <w:r>
-              <w:rPr>
-                <w:sz w:val="19"/>
-              </w:rPr>
-              <w:t>1</w:t>
-            </w:r>
-          </w:p>
-        </w:tc>
-        <w:tc>
-          <w:tcPr>
-            <w:tcW w:type="dxa" w:w="3120"/>
-          </w:tcPr>
-          <w:p>
-            <w:pPr>
-              <w:spacing w:after="0"/>
-            </w:pPr>
-            <w:r/>
-            <w:r>
-              <w:rPr>
-                <w:sz w:val="19"/>
-              </w:rPr>
-              <w:t>2.95 km</w:t>
-            </w:r>
-          </w:p>
-        </w:tc>
-        <w:tc>
-          <w:tcPr>
-            <w:tcW w:type="dxa" w:w="3120"/>
-          </w:tcPr>
-          <w:p>
-            <w:pPr>
-              <w:spacing w:after="0"/>
-            </w:pPr>
-            <w:r/>
-            <w:r>
-              <w:rPr>
-                <w:sz w:val="19"/>
-              </w:rPr>
-              <w:t>the Sun, as a comparison</w:t>
-            </w:r>
-          </w:p>
-        </w:tc>
-      </w:tr>
-      <w:tr>
-        <w:tc>
-          <w:tcPr>
-            <w:tcW w:type="dxa" w:w="3120"/>
-          </w:tcPr>
-          <w:p>
-            <w:pPr>
-              <w:spacing w:after="0"/>
-            </w:pPr>
-            <w:r/>
-            <w:r>
-              <w:rPr>
-                <w:sz w:val="19"/>
-              </w:rPr>
-              <w:t>3</w:t>
-            </w:r>
-          </w:p>
-        </w:tc>
-        <w:tc>
-          <w:tcPr>
-            <w:tcW w:type="dxa" w:w="3120"/>
-          </w:tcPr>
-          <w:p>
-            <w:pPr>
-              <w:spacing w:after="0"/>
-            </w:pPr>
-            <w:r/>
-            <w:r>
-              <w:rPr>
-                <w:sz w:val="19"/>
-              </w:rPr>
-              <w:t>8.9 km</w:t>
-            </w:r>
-          </w:p>
-        </w:tc>
-        <w:tc>
-          <w:tcPr>
-            <w:tcW w:type="dxa" w:w="3120"/>
-          </w:tcPr>
-          <w:p>
-            <w:pPr>
-              <w:spacing w:after="0"/>
-            </w:pPr>
-            <w:r/>
-            <w:r>
-              <w:rPr>
-                <w:sz w:val="19"/>
-              </w:rPr>
-              <w:t>just past the heaviest neutron stars</w:t>
-            </w:r>
-          </w:p>
-        </w:tc>
-      </w:tr>
-      <w:tr>
-        <w:tc>
-          <w:tcPr>
-            <w:tcW w:type="dxa" w:w="3120"/>
-          </w:tcPr>
-          <w:p>
-            <w:pPr>
-              <w:spacing w:after="0"/>
-            </w:pPr>
-            <w:r/>
-            <w:r>
-              <w:rPr>
-                <w:sz w:val="19"/>
-              </w:rPr>
-              <w:t>10</w:t>
-            </w:r>
-          </w:p>
-        </w:tc>
-        <w:tc>
-          <w:tcPr>
-            <w:tcW w:type="dxa" w:w="3120"/>
-          </w:tcPr>
-          <w:p>
-            <w:pPr>
-              <w:spacing w:after="0"/>
-            </w:pPr>
-            <w:r/>
-            <w:r>
-              <w:rPr>
-                <w:sz w:val="19"/>
-              </w:rPr>
-              <w:t>29.5 km</w:t>
-            </w:r>
-          </w:p>
-        </w:tc>
-        <w:tc>
-          <w:tcPr>
-            <w:tcW w:type="dxa" w:w="3120"/>
-          </w:tcPr>
-          <w:p>
-            <w:pPr>
-              <w:spacing w:after="0"/>
-            </w:pPr>
-            <w:r/>
-            <w:r>
-              <w:rPr>
-                <w:sz w:val="19"/>
-              </w:rPr>
-              <w:t>a typical stellar black hole</w:t>
-            </w:r>
-          </w:p>
-        </w:tc>
-      </w:tr>
-      <w:tr>
-        <w:tc>
-          <w:tcPr>
-            <w:tcW w:type="dxa" w:w="3120"/>
-          </w:tcPr>
-          <w:p>
-            <w:pPr>
-              <w:spacing w:after="0"/>
-            </w:pPr>
-            <w:r/>
-            <w:r>
-              <w:rPr>
-                <w:sz w:val="19"/>
-              </w:rPr>
-              <w:t>36</w:t>
-            </w:r>
-          </w:p>
-        </w:tc>
-        <w:tc>
-          <w:tcPr>
-            <w:tcW w:type="dxa" w:w="3120"/>
-          </w:tcPr>
-          <w:p>
-            <w:pPr>
-              <w:spacing w:after="0"/>
-            </w:pPr>
-            <w:r/>
-            <w:r>
-              <w:rPr>
-                <w:sz w:val="19"/>
-              </w:rPr>
-              <w:t>106 km</w:t>
-            </w:r>
-          </w:p>
-        </w:tc>
-        <w:tc>
-          <w:tcPr>
-            <w:tcW w:type="dxa" w:w="3120"/>
-          </w:tcPr>
-          <w:p>
-            <w:pPr>
-              <w:spacing w:after="0"/>
-            </w:pPr>
-            <w:r/>
-            <w:r>
-              <w:rPr>
-                <w:sz w:val="19"/>
-              </w:rPr>
-              <w:t>the heavier hole in GW150914</w:t>
-            </w:r>
-          </w:p>
-        </w:tc>
-      </w:tr>
-      <w:tr>
-        <w:tc>
-          <w:tcPr>
-            <w:tcW w:type="dxa" w:w="3120"/>
-          </w:tcPr>
-          <w:p>
-            <w:pPr>
-              <w:spacing w:after="0"/>
-            </w:pPr>
-            <w:r/>
-            <w:r>
-              <w:rPr>
-                <w:sz w:val="19"/>
-              </w:rPr>
-              <w:t>62</w:t>
-            </w:r>
-          </w:p>
-        </w:tc>
-        <w:tc>
-          <w:tcPr>
-            <w:tcW w:type="dxa" w:w="3120"/>
-          </w:tcPr>
-          <w:p>
-            <w:pPr>
-              <w:spacing w:after="0"/>
-            </w:pPr>
-            <w:r/>
-            <w:r>
-              <w:rPr>
-                <w:sz w:val="19"/>
-              </w:rPr>
-              <w:t>183 km</w:t>
-            </w:r>
-          </w:p>
-        </w:tc>
-        <w:tc>
-          <w:tcPr>
-            <w:tcW w:type="dxa" w:w="3120"/>
-          </w:tcPr>
-          <w:p>
-            <w:pPr>
-              <w:spacing w:after="0"/>
-            </w:pPr>
-            <w:r/>
-            <w:r>
-              <w:rPr>
-                <w:sz w:val="19"/>
-              </w:rPr>
-              <w:t>the hole GW150914 left behind</w:t>
-            </w:r>
-          </w:p>
-        </w:tc>
-      </w:tr>
-      <w:tr>
-        <w:tc>
-          <w:tcPr>
-            <w:tcW w:type="dxa" w:w="3120"/>
-          </w:tcPr>
-          <w:p>
-            <w:pPr>
-              <w:spacing w:after="0"/>
-            </w:pPr>
-            <w:r/>
-            <w:r>
-              <w:rPr>
-                <w:sz w:val="19"/>
-              </w:rPr>
-              <w:t>100</w:t>
-            </w:r>
-          </w:p>
-        </w:tc>
-        <w:tc>
-          <w:tcPr>
-            <w:tcW w:type="dxa" w:w="3120"/>
-          </w:tcPr>
-          <w:p>
-            <w:pPr>
-              <w:spacing w:after="0"/>
-            </w:pPr>
-            <w:r/>
-            <w:r>
-              <w:rPr>
-                <w:sz w:val="19"/>
-              </w:rPr>
-              <w:t>295 km</w:t>
-            </w:r>
-          </w:p>
-        </w:tc>
-        <w:tc>
-          <w:tcPr>
-            <w:tcW w:type="dxa" w:w="3120"/>
-          </w:tcPr>
-          <w:p>
-            <w:pPr>
-              <w:spacing w:after="0"/>
-            </w:pPr>
-            <w:r/>
-            <w:r>
-              <w:rPr>
-                <w:sz w:val="19"/>
-              </w:rPr>
-            </w:r>
-          </w:p>
-        </w:tc>
-      </w:tr>
-      <w:tr>
-        <w:tc>
-          <w:tcPr>
-            <w:tcW w:type="dxa" w:w="3120"/>
-          </w:tcPr>
-          <w:p>
-            <w:pPr>
-              <w:spacing w:after="0"/>
-            </w:pPr>
-            <w:r/>
-            <w:r>
-              <w:rPr>
-                <w:sz w:val="19"/>
-              </w:rPr>
-              <w:t>1,000</w:t>
-            </w:r>
-          </w:p>
-        </w:tc>
-        <w:tc>
-          <w:tcPr>
-            <w:tcW w:type="dxa" w:w="3120"/>
-          </w:tcPr>
-          <w:p>
-            <w:pPr>
-              <w:spacing w:after="0"/>
-            </w:pPr>
-            <w:r/>
-            <w:r>
-              <w:rPr>
-                <w:sz w:val="19"/>
-              </w:rPr>
-              <w:t>2,950 km</w:t>
-            </w:r>
-          </w:p>
-        </w:tc>
-        <w:tc>
-          <w:tcPr>
-            <w:tcW w:type="dxa" w:w="3120"/>
-          </w:tcPr>
-          <w:p>
-            <w:pPr>
-              <w:spacing w:after="0"/>
-            </w:pPr>
-            <w:r/>
-            <w:r>
-              <w:rPr>
-                <w:sz w:val="19"/>
-              </w:rPr>
-            </w:r>
-          </w:p>
-        </w:tc>
-      </w:tr>
-      <w:tr>
-        <w:tc>
-          <w:tcPr>
-            <w:tcW w:type="dxa" w:w="3120"/>
-          </w:tcPr>
-          <w:p>
-            <w:pPr>
-              <w:spacing w:after="0"/>
-            </w:pPr>
-            <w:r/>
-            <w:r>
-              <w:rPr>
-                <w:sz w:val="19"/>
-              </w:rPr>
-              <w:t>4.3 million</w:t>
-            </w:r>
-          </w:p>
-        </w:tc>
-        <w:tc>
-          <w:tcPr>
-            <w:tcW w:type="dxa" w:w="3120"/>
-          </w:tcPr>
-          <w:p>
-            <w:pPr>
-              <w:spacing w:after="0"/>
-            </w:pPr>
-            <w:r/>
-            <w:r>
-              <w:rPr>
-                <w:sz w:val="19"/>
-              </w:rPr>
-              <w:t>12.7 million km (0.085 AU)</w:t>
-            </w:r>
-          </w:p>
-        </w:tc>
-        <w:tc>
-          <w:tcPr>
-            <w:tcW w:type="dxa" w:w="3120"/>
-          </w:tcPr>
-          <w:p>
-            <w:pPr>
-              <w:spacing w:after="0"/>
-            </w:pPr>
-            <w:r/>
-            <w:r>
-              <w:rPr>
-                <w:sz w:val="19"/>
-              </w:rPr>
-              <w:t>Sgr A*, the center of the Milky Way</w:t>
-            </w:r>
-          </w:p>
-        </w:tc>
-      </w:tr>
-      <w:tr>
-        <w:tc>
-          <w:tcPr>
-            <w:tcW w:type="dxa" w:w="3120"/>
-          </w:tcPr>
-          <w:p>
-            <w:pPr>
-              <w:spacing w:after="0"/>
-            </w:pPr>
-            <w:r/>
-            <w:r>
-              <w:rPr>
-                <w:sz w:val="19"/>
-              </w:rPr>
-              <w:t>6.5 billion</w:t>
-            </w:r>
-          </w:p>
-        </w:tc>
-        <w:tc>
-          <w:tcPr>
-            <w:tcW w:type="dxa" w:w="3120"/>
-          </w:tcPr>
-          <w:p>
-            <w:pPr>
-              <w:spacing w:after="0"/>
-            </w:pPr>
-            <w:r/>
-            <w:r>
-              <w:rPr>
-                <w:sz w:val="19"/>
-              </w:rPr>
-              <w:t>19.2 billion km (128 AU)</w:t>
-            </w:r>
-          </w:p>
-        </w:tc>
-        <w:tc>
-          <w:tcPr>
-            <w:tcW w:type="dxa" w:w="3120"/>
-          </w:tcPr>
-          <w:p>
-            <w:pPr>
-              <w:spacing w:after="0"/>
-            </w:pPr>
-            <w:r/>
-            <w:r>
-              <w:rPr>
-                <w:sz w:val="19"/>
-              </w:rPr>
-              <w:t>M87*</w:t>
-            </w:r>
-          </w:p>
-        </w:tc>
-      </w:tr>
-    </w:tbl>
+    <w:p>
+      <w:pPr>
+        <w:jc w:val="center"/>
+        <w:spacing w:before="60" w:after="120"/>
+      </w:pPr>
+      <w:r xmlns:a="http://schemas.openxmlformats.org/drawingml/2006/main" xmlns:pic="http://schemas.openxmlformats.org/drawingml/2006/picture">
+        <w:drawing>
+          <wp:inline distT="0" distB="0" distL="0" distR="0">
+            <wp:extent cx="5486400" cy="2961564"/>
+            <wp:docPr id="2017" name="Table 2" descr="Mass (Suns) | Horizon radius | Example. 1 | 2.95 km | the Sun, as a comparison. 3 | 8.9 km | just past the heaviest neutron stars. 10 | 29.5 km | a typical stellar black hole. 36 | 106 km | the heavier hole in GW150914. 62 | 183 km | the hole GW150914 left behind. 100 | 295 km. 1,000 | 2,950 km. 4.3 million | 12.7 million km (0.085 AU) | Sgr A*, the center of the Milky Way. 6.5 billion | 19.2 billion km (128 AU) | M87*"/>
+            <wp:cNvGraphicFramePr>
+              <a:graphicFrameLocks noChangeAspect="1"/>
+            </wp:cNvGraphicFramePr>
+            <a:graphic>
+              <a:graphicData uri="http://schemas.openxmlformats.org/drawingml/2006/picture">
+                <pic:pic>
+                  <pic:nvPicPr>
+                    <pic:cNvPr id="2017" name="Table 2"/>
+                    <pic:cNvPicPr/>
+                  </pic:nvPicPr>
+                  <pic:blipFill>
+                    <a:blip r:embed="rIdTbl2"/>
+                    <a:stretch>
+                      <a:fillRect/>
+                    </a:stretch>
+                  </pic:blipFill>
+                  <pic:spPr>
+                    <a:xfrm>
+                      <a:off x="0" y="0"/>
+                      <a:ext cx="5486400" cy="2961564"/>
+                    </a:xfrm>
+                    <a:prstGeom prst="rect">
+                      <a:avLst/>
+                    </a:prstGeom>
+                  </pic:spPr>
+                </pic:pic>
+              </a:graphicData>
+            </a:graphic>
+          </wp:inline>
+        </w:drawing>
+      </w:r>
+    </w:p>
     <w:p/>
     <w:p>
       <w:pPr>
@@ -16410,447 +15017,48 @@
         <w:t>Worked row, a GPS satellite. The height term is (GM/c²)(1/R − 1/r), with GM/c² = 4.435 mm for the Earth, R = 6,371 km, and r = 6,371 + 20,200 = 26,571 km. That is 5.29 × 10⁻¹⁰, or 45.7 µs a day. For an orbit, subtract the speed term v²/2c², which is 7.2 µs a day at GPS speed. For a tower or a mountain, gh/c² gives the same answer as the exact formula. For an orbit it does not, because g weakens with height.</w:t>
       </w:r>
     </w:p>
-    <w:tbl>
-      <w:tblPr>
-        <w:tblStyle w:val="TableGrid"/>
-        <w:tblW w:type="auto" w:w="0"/>
-        <w:tblLook w:firstColumn="1" w:firstRow="1" w:lastColumn="0" w:lastRow="0" w:noHBand="0" w:noVBand="1" w:val="04A0"/>
-      </w:tblPr>
-      <w:tblGrid>
-        <w:gridCol w:w="2340"/>
-        <w:gridCol w:w="2340"/>
-        <w:gridCol w:w="2340"/>
-        <w:gridCol w:w="2340"/>
-      </w:tblGrid>
-      <w:tr>
-        <w:tc>
-          <w:tcPr>
-            <w:tcW w:type="dxa" w:w="2340"/>
-            <w:shd w:val="clear" w:color="auto" w:fill="DCE6F0"/>
-          </w:tcPr>
-          <w:p>
-            <w:pPr>
-              <w:spacing w:after="0"/>
-            </w:pPr>
-            <w:r/>
-            <w:r>
-              <w:rPr>
-                <w:b/>
-                <w:sz w:val="19"/>
-              </w:rPr>
-              <w:t>Place (height)</w:t>
-            </w:r>
-          </w:p>
-        </w:tc>
-        <w:tc>
-          <w:tcPr>
-            <w:tcW w:type="dxa" w:w="2340"/>
-            <w:shd w:val="clear" w:color="auto" w:fill="DCE6F0"/>
-          </w:tcPr>
-          <w:p>
-            <w:pPr>
-              <w:spacing w:after="0"/>
-            </w:pPr>
-            <w:r/>
-            <w:r>
-              <w:rPr>
-                <w:b/>
-                <w:sz w:val="19"/>
-              </w:rPr>
-              <w:t>Height term, µs/day</w:t>
-            </w:r>
-          </w:p>
-        </w:tc>
-        <w:tc>
-          <w:tcPr>
-            <w:tcW w:type="dxa" w:w="2340"/>
-            <w:shd w:val="clear" w:color="auto" w:fill="DCE6F0"/>
-          </w:tcPr>
-          <w:p>
-            <w:pPr>
-              <w:spacing w:after="0"/>
-            </w:pPr>
-            <w:r/>
-            <w:r>
-              <w:rPr>
-                <w:b/>
-                <w:sz w:val="19"/>
-              </w:rPr>
-              <w:t>Speed term, µs/day</w:t>
-            </w:r>
-          </w:p>
-        </w:tc>
-        <w:tc>
-          <w:tcPr>
-            <w:tcW w:type="dxa" w:w="2340"/>
-            <w:shd w:val="clear" w:color="auto" w:fill="DCE6F0"/>
-          </w:tcPr>
-          <w:p>
-            <w:pPr>
-              <w:spacing w:after="0"/>
-            </w:pPr>
-            <w:r/>
-            <w:r>
-              <w:rPr>
-                <w:b/>
-                <w:sz w:val="19"/>
-              </w:rPr>
-              <w:t>Net vs ground, µs/day</w:t>
-            </w:r>
-          </w:p>
-        </w:tc>
-      </w:tr>
-      <w:tr>
-        <w:tc>
-          <w:tcPr>
-            <w:tcW w:type="dxa" w:w="2340"/>
-          </w:tcPr>
-          <w:p>
-            <w:pPr>
-              <w:spacing w:after="0"/>
-            </w:pPr>
-            <w:r/>
-            <w:r>
-              <w:rPr>
-                <w:sz w:val="19"/>
-              </w:rPr>
-              <w:t>Harvard tower (22.5 m)</w:t>
-            </w:r>
-          </w:p>
-        </w:tc>
-        <w:tc>
-          <w:tcPr>
-            <w:tcW w:type="dxa" w:w="2340"/>
-          </w:tcPr>
-          <w:p>
-            <w:pPr>
-              <w:spacing w:after="0"/>
-            </w:pPr>
-            <w:r/>
-            <w:r>
-              <w:rPr>
-                <w:sz w:val="19"/>
-              </w:rPr>
-              <w:t>+0.000212</w:t>
-            </w:r>
-          </w:p>
-        </w:tc>
-        <w:tc>
-          <w:tcPr>
-            <w:tcW w:type="dxa" w:w="2340"/>
-          </w:tcPr>
-          <w:p>
-            <w:pPr>
-              <w:spacing w:after="0"/>
-            </w:pPr>
-            <w:r/>
-            <w:r>
-              <w:rPr>
-                <w:sz w:val="19"/>
-              </w:rPr>
-              <w:t>0</w:t>
-            </w:r>
-          </w:p>
-        </w:tc>
-        <w:tc>
-          <w:tcPr>
-            <w:tcW w:type="dxa" w:w="2340"/>
-          </w:tcPr>
-          <w:p>
-            <w:pPr>
-              <w:spacing w:after="0"/>
-            </w:pPr>
-            <w:r/>
-            <w:r>
-              <w:rPr>
-                <w:sz w:val="19"/>
-              </w:rPr>
-              <w:t>+0.000212</w:t>
-            </w:r>
-          </w:p>
-        </w:tc>
-      </w:tr>
-      <w:tr>
-        <w:tc>
-          <w:tcPr>
-            <w:tcW w:type="dxa" w:w="2340"/>
-          </w:tcPr>
-          <w:p>
-            <w:pPr>
-              <w:spacing w:after="0"/>
-            </w:pPr>
-            <w:r/>
-            <w:r>
-              <w:rPr>
-                <w:sz w:val="19"/>
-              </w:rPr>
-              <w:t>Mount Everest (8.8 km)</w:t>
-            </w:r>
-          </w:p>
-        </w:tc>
-        <w:tc>
-          <w:tcPr>
-            <w:tcW w:type="dxa" w:w="2340"/>
-          </w:tcPr>
-          <w:p>
-            <w:pPr>
-              <w:spacing w:after="0"/>
-            </w:pPr>
-            <w:r/>
-            <w:r>
-              <w:rPr>
-                <w:sz w:val="19"/>
-              </w:rPr>
-              <w:t>+0.083</w:t>
-            </w:r>
-          </w:p>
-        </w:tc>
-        <w:tc>
-          <w:tcPr>
-            <w:tcW w:type="dxa" w:w="2340"/>
-          </w:tcPr>
-          <w:p>
-            <w:pPr>
-              <w:spacing w:after="0"/>
-            </w:pPr>
-            <w:r/>
-            <w:r>
-              <w:rPr>
-                <w:sz w:val="19"/>
-              </w:rPr>
-              <w:t>0</w:t>
-            </w:r>
-          </w:p>
-        </w:tc>
-        <w:tc>
-          <w:tcPr>
-            <w:tcW w:type="dxa" w:w="2340"/>
-          </w:tcPr>
-          <w:p>
-            <w:pPr>
-              <w:spacing w:after="0"/>
-            </w:pPr>
-            <w:r/>
-            <w:r>
-              <w:rPr>
-                <w:sz w:val="19"/>
-              </w:rPr>
-              <w:t>+0.083</w:t>
-            </w:r>
-          </w:p>
-        </w:tc>
-      </w:tr>
-      <w:tr>
-        <w:tc>
-          <w:tcPr>
-            <w:tcW w:type="dxa" w:w="2340"/>
-          </w:tcPr>
-          <w:p>
-            <w:pPr>
-              <w:spacing w:after="0"/>
-            </w:pPr>
-            <w:r/>
-            <w:r>
-              <w:rPr>
-                <w:sz w:val="19"/>
-              </w:rPr>
-              <w:t>Space station (400 km)</w:t>
-            </w:r>
-          </w:p>
-        </w:tc>
-        <w:tc>
-          <w:tcPr>
-            <w:tcW w:type="dxa" w:w="2340"/>
-          </w:tcPr>
-          <w:p>
-            <w:pPr>
-              <w:spacing w:after="0"/>
-            </w:pPr>
-            <w:r/>
-            <w:r>
-              <w:rPr>
-                <w:sz w:val="19"/>
-              </w:rPr>
-              <w:t>+3.6</w:t>
-            </w:r>
-          </w:p>
-        </w:tc>
-        <w:tc>
-          <w:tcPr>
-            <w:tcW w:type="dxa" w:w="2340"/>
-          </w:tcPr>
-          <w:p>
-            <w:pPr>
-              <w:spacing w:after="0"/>
-            </w:pPr>
-            <w:r/>
-            <w:r>
-              <w:rPr>
-                <w:sz w:val="19"/>
-              </w:rPr>
-              <w:t>−28.3</w:t>
-            </w:r>
-          </w:p>
-        </w:tc>
-        <w:tc>
-          <w:tcPr>
-            <w:tcW w:type="dxa" w:w="2340"/>
-          </w:tcPr>
-          <w:p>
-            <w:pPr>
-              <w:spacing w:after="0"/>
-            </w:pPr>
-            <w:r/>
-            <w:r>
-              <w:rPr>
-                <w:sz w:val="19"/>
-              </w:rPr>
-              <w:t>−24.7</w:t>
-            </w:r>
-          </w:p>
-        </w:tc>
-      </w:tr>
-      <w:tr>
-        <w:tc>
-          <w:tcPr>
-            <w:tcW w:type="dxa" w:w="2340"/>
-          </w:tcPr>
-          <w:p>
-            <w:pPr>
-              <w:spacing w:after="0"/>
-            </w:pPr>
-            <w:r/>
-            <w:r>
-              <w:rPr>
-                <w:sz w:val="19"/>
-              </w:rPr>
-              <w:t>GPS satellite (20,200 km)</w:t>
-            </w:r>
-          </w:p>
-        </w:tc>
-        <w:tc>
-          <w:tcPr>
-            <w:tcW w:type="dxa" w:w="2340"/>
-          </w:tcPr>
-          <w:p>
-            <w:pPr>
-              <w:spacing w:after="0"/>
-            </w:pPr>
-            <w:r/>
-            <w:r>
-              <w:rPr>
-                <w:sz w:val="19"/>
-              </w:rPr>
-              <w:t>+45.7</w:t>
-            </w:r>
-          </w:p>
-        </w:tc>
-        <w:tc>
-          <w:tcPr>
-            <w:tcW w:type="dxa" w:w="2340"/>
-          </w:tcPr>
-          <w:p>
-            <w:pPr>
-              <w:spacing w:after="0"/>
-            </w:pPr>
-            <w:r/>
-            <w:r>
-              <w:rPr>
-                <w:sz w:val="19"/>
-              </w:rPr>
-              <w:t>−7.2</w:t>
-            </w:r>
-          </w:p>
-        </w:tc>
-        <w:tc>
-          <w:tcPr>
-            <w:tcW w:type="dxa" w:w="2340"/>
-          </w:tcPr>
-          <w:p>
-            <w:pPr>
-              <w:spacing w:after="0"/>
-            </w:pPr>
-            <w:r/>
-            <w:r>
-              <w:rPr>
-                <w:sz w:val="19"/>
-              </w:rPr>
-              <w:t>+38.5</w:t>
-            </w:r>
-          </w:p>
-        </w:tc>
-      </w:tr>
-      <w:tr>
-        <w:tc>
-          <w:tcPr>
-            <w:tcW w:type="dxa" w:w="2340"/>
-          </w:tcPr>
-          <w:p>
-            <w:pPr>
-              <w:spacing w:after="0"/>
-            </w:pPr>
-            <w:r/>
-            <w:r>
-              <w:rPr>
-                <w:sz w:val="19"/>
-              </w:rPr>
-              <w:t>Geostationary (35,786 km)</w:t>
-            </w:r>
-          </w:p>
-        </w:tc>
-        <w:tc>
-          <w:tcPr>
-            <w:tcW w:type="dxa" w:w="2340"/>
-          </w:tcPr>
-          <w:p>
-            <w:pPr>
-              <w:spacing w:after="0"/>
-            </w:pPr>
-            <w:r/>
-            <w:r>
-              <w:rPr>
-                <w:sz w:val="19"/>
-              </w:rPr>
-              <w:t>+51.1</w:t>
-            </w:r>
-          </w:p>
-        </w:tc>
-        <w:tc>
-          <w:tcPr>
-            <w:tcW w:type="dxa" w:w="2340"/>
-          </w:tcPr>
-          <w:p>
-            <w:pPr>
-              <w:spacing w:after="0"/>
-            </w:pPr>
-            <w:r/>
-            <w:r>
-              <w:rPr>
-                <w:sz w:val="19"/>
-              </w:rPr>
-              <w:t>−4.5</w:t>
-            </w:r>
-          </w:p>
-        </w:tc>
-        <w:tc>
-          <w:tcPr>
-            <w:tcW w:type="dxa" w:w="2340"/>
-          </w:tcPr>
-          <w:p>
-            <w:pPr>
-              <w:spacing w:after="0"/>
-            </w:pPr>
-            <w:r/>
-            <w:r>
-              <w:rPr>
-                <w:sz w:val="19"/>
-              </w:rPr>
-              <w:t>+46.5</w:t>
-            </w:r>
-          </w:p>
-        </w:tc>
-      </w:tr>
-    </w:tbl>
+    <w:p>
+      <w:pPr>
+        <w:jc w:val="center"/>
+        <w:spacing w:before="60" w:after="120"/>
+      </w:pPr>
+      <w:r xmlns:a="http://schemas.openxmlformats.org/drawingml/2006/main" xmlns:pic="http://schemas.openxmlformats.org/drawingml/2006/picture">
+        <w:drawing>
+          <wp:inline distT="0" distB="0" distL="0" distR="0">
+            <wp:extent cx="5486400" cy="2402005"/>
+            <wp:docPr id="2018" name="Table 3" descr="Place (height) | Height term, µs/day | Speed term, µs/day | Net vs ground, µs/day. Harvard tower (22.5 m) | +0.000212 | 0 | +0.000212. Mount Everest (8.8 km) | +0.083 | 0 | +0.083. Space station (400 km) | +3.6 | −28.3 | −24.7. GPS satellite (20,200 km) | +45.7 | −7.2 | +38.5. Geostationary (35,786 km) | +51.1 | −4.5 | +46.5"/>
+            <wp:cNvGraphicFramePr>
+              <a:graphicFrameLocks noChangeAspect="1"/>
+            </wp:cNvGraphicFramePr>
+            <a:graphic>
+              <a:graphicData uri="http://schemas.openxmlformats.org/drawingml/2006/picture">
+                <pic:pic>
+                  <pic:nvPicPr>
+                    <pic:cNvPr id="2018" name="Table 3"/>
+                    <pic:cNvPicPr/>
+                  </pic:nvPicPr>
+                  <pic:blipFill>
+                    <a:blip r:embed="rIdTbl3"/>
+                    <a:stretch>
+                      <a:fillRect/>
+                    </a:stretch>
+                  </pic:blipFill>
+                  <pic:spPr>
+                    <a:xfrm>
+                      <a:off x="0" y="0"/>
+                      <a:ext cx="5486400" cy="2402005"/>
+                    </a:xfrm>
+                    <a:prstGeom prst="rect">
+                      <a:avLst/>
+                    </a:prstGeom>
+                  </pic:spPr>
+                </pic:pic>
+              </a:graphicData>
+            </a:graphic>
+          </wp:inline>
+        </w:drawing>
+      </w:r>
+    </w:p>
     <w:p/>
     <w:p>
       <w:r>
@@ -16869,448 +15077,430 @@
       </w:r>
       <w:bookmarkEnd w:id="112"/>
     </w:p>
-    <w:tbl>
-      <w:tblPr>
-        <w:tblStyle w:val="TableGrid"/>
-        <w:tblW w:type="auto" w:w="0"/>
-        <w:tblLook w:firstColumn="1" w:firstRow="1" w:lastColumn="0" w:lastRow="0" w:noHBand="0" w:noVBand="1" w:val="04A0"/>
-      </w:tblPr>
-      <w:tblGrid>
-        <w:gridCol w:w="3120"/>
-        <w:gridCol w:w="3120"/>
-        <w:gridCol w:w="3120"/>
-      </w:tblGrid>
-      <w:tr>
-        <w:tc>
-          <w:tcPr>
-            <w:tcW w:type="dxa" w:w="3120"/>
-            <w:shd w:val="clear" w:color="auto" w:fill="DCE6F0"/>
-          </w:tcPr>
-          <w:p>
-            <w:pPr>
-              <w:spacing w:after="0"/>
-            </w:pPr>
-            <w:r/>
-            <w:r>
-              <w:rPr>
-                <w:b/>
-                <w:sz w:val="19"/>
-              </w:rPr>
-              <w:t>Quantity</w:t>
-            </w:r>
-          </w:p>
-        </w:tc>
-        <w:tc>
-          <w:tcPr>
-            <w:tcW w:type="dxa" w:w="3120"/>
-            <w:shd w:val="clear" w:color="auto" w:fill="DCE6F0"/>
-          </w:tcPr>
-          <w:p>
-            <w:pPr>
-              <w:spacing w:after="0"/>
-            </w:pPr>
-            <w:r/>
-            <w:r>
-              <w:rPr>
-                <w:b/>
-                <w:sz w:val="19"/>
-              </w:rPr>
-              <w:t>Value</w:t>
-            </w:r>
-          </w:p>
-        </w:tc>
-        <w:tc>
-          <w:tcPr>
-            <w:tcW w:type="dxa" w:w="3120"/>
-            <w:shd w:val="clear" w:color="auto" w:fill="DCE6F0"/>
-          </w:tcPr>
-          <w:p>
-            <w:pPr>
-              <w:spacing w:after="0"/>
-            </w:pPr>
-            <w:r/>
-            <w:r>
-              <w:rPr>
-                <w:b/>
-                <w:sz w:val="19"/>
-              </w:rPr>
-              <w:t>Where it appears</w:t>
-            </w:r>
-          </w:p>
-        </w:tc>
-      </w:tr>
-      <w:tr>
-        <w:tc>
-          <w:tcPr>
-            <w:tcW w:type="dxa" w:w="3120"/>
-          </w:tcPr>
-          <w:p>
-            <w:pPr>
-              <w:spacing w:after="0"/>
-            </w:pPr>
-            <w:r/>
-            <w:r>
-              <w:rPr>
-                <w:sz w:val="19"/>
-              </w:rPr>
-              <w:t>Ordinary matter</w:t>
-            </w:r>
-          </w:p>
-        </w:tc>
-        <w:tc>
-          <w:tcPr>
-            <w:tcW w:type="dxa" w:w="3120"/>
-          </w:tcPr>
-          <w:p>
-            <w:pPr>
-              <w:spacing w:after="0"/>
-            </w:pPr>
-            <w:r/>
-            <w:r>
-              <w:rPr>
-                <w:sz w:val="19"/>
-              </w:rPr>
-              <w:t>about 5 percent</w:t>
-            </w:r>
-          </w:p>
-        </w:tc>
-        <w:tc>
-          <w:tcPr>
-            <w:tcW w:type="dxa" w:w="3120"/>
-          </w:tcPr>
-          <w:p>
-            <w:pPr>
-              <w:spacing w:after="0"/>
-            </w:pPr>
-            <w:r/>
-            <w:r>
-              <w:rPr>
-                <w:sz w:val="19"/>
-              </w:rPr>
-              <w:t>stars, gas, planets, people</w:t>
-            </w:r>
-          </w:p>
-        </w:tc>
-      </w:tr>
-      <w:tr>
-        <w:tc>
-          <w:tcPr>
-            <w:tcW w:type="dxa" w:w="3120"/>
-          </w:tcPr>
-          <w:p>
-            <w:pPr>
-              <w:spacing w:after="0"/>
-            </w:pPr>
-            <w:r/>
-            <w:r>
-              <w:rPr>
-                <w:sz w:val="19"/>
-              </w:rPr>
-              <w:t>Dark matter</w:t>
-            </w:r>
-          </w:p>
-        </w:tc>
-        <w:tc>
-          <w:tcPr>
-            <w:tcW w:type="dxa" w:w="3120"/>
-          </w:tcPr>
-          <w:p>
-            <w:pPr>
-              <w:spacing w:after="0"/>
-            </w:pPr>
-            <w:r/>
-            <w:r>
-              <w:rPr>
-                <w:sz w:val="19"/>
-              </w:rPr>
-              <w:t>about 27 percent</w:t>
-            </w:r>
-          </w:p>
-        </w:tc>
-        <w:tc>
-          <w:tcPr>
-            <w:tcW w:type="dxa" w:w="3120"/>
-          </w:tcPr>
-          <w:p>
-            <w:pPr>
-              <w:spacing w:after="0"/>
-            </w:pPr>
-            <w:r/>
-            <w:r>
-              <w:rPr>
-                <w:sz w:val="19"/>
-              </w:rPr>
-              <w:t>extra bend, no identified owner</w:t>
-            </w:r>
-          </w:p>
-        </w:tc>
-      </w:tr>
-      <w:tr>
-        <w:tc>
-          <w:tcPr>
-            <w:tcW w:type="dxa" w:w="3120"/>
-          </w:tcPr>
-          <w:p>
-            <w:pPr>
-              <w:spacing w:after="0"/>
-            </w:pPr>
-            <w:r/>
-            <w:r>
-              <w:rPr>
-                <w:sz w:val="19"/>
-              </w:rPr>
-              <w:t>Dark energy</w:t>
-            </w:r>
-          </w:p>
-        </w:tc>
-        <w:tc>
-          <w:tcPr>
-            <w:tcW w:type="dxa" w:w="3120"/>
-          </w:tcPr>
-          <w:p>
-            <w:pPr>
-              <w:spacing w:after="0"/>
-            </w:pPr>
-            <w:r/>
-            <w:r>
-              <w:rPr>
-                <w:sz w:val="19"/>
-              </w:rPr>
-              <w:t>about 68 percent</w:t>
-            </w:r>
-          </w:p>
-        </w:tc>
-        <w:tc>
-          <w:tcPr>
-            <w:tcW w:type="dxa" w:w="3120"/>
-          </w:tcPr>
-          <w:p>
-            <w:pPr>
-              <w:spacing w:after="0"/>
-            </w:pPr>
-            <w:r/>
-            <w:r>
-              <w:rPr>
-                <w:sz w:val="19"/>
-              </w:rPr>
-              <w:t>the label on the speedup</w:t>
-            </w:r>
-          </w:p>
-        </w:tc>
-      </w:tr>
-      <w:tr>
-        <w:tc>
-          <w:tcPr>
-            <w:tcW w:type="dxa" w:w="3120"/>
-          </w:tcPr>
-          <w:p>
-            <w:pPr>
-              <w:spacing w:after="0"/>
-            </w:pPr>
-            <w:r/>
-            <w:r>
-              <w:rPr>
-                <w:sz w:val="19"/>
-              </w:rPr>
-              <w:t>Microwave glow today</w:t>
-            </w:r>
-          </w:p>
-        </w:tc>
-        <w:tc>
-          <w:tcPr>
-            <w:tcW w:type="dxa" w:w="3120"/>
-          </w:tcPr>
-          <w:p>
-            <w:pPr>
-              <w:spacing w:after="0"/>
-            </w:pPr>
-            <w:r/>
-            <w:r>
-              <w:rPr>
-                <w:sz w:val="19"/>
-              </w:rPr>
-              <w:t>2.725 K</w:t>
-            </w:r>
-          </w:p>
-        </w:tc>
-        <w:tc>
-          <w:tcPr>
-            <w:tcW w:type="dxa" w:w="3120"/>
-          </w:tcPr>
-          <w:p>
-            <w:pPr>
-              <w:spacing w:after="0"/>
-            </w:pPr>
-            <w:r/>
-            <w:r>
-              <w:rPr>
-                <w:sz w:val="19"/>
-              </w:rPr>
-              <w:t>the cooled early light</w:t>
-            </w:r>
-          </w:p>
-        </w:tc>
-      </w:tr>
-      <w:tr>
-        <w:tc>
-          <w:tcPr>
-            <w:tcW w:type="dxa" w:w="3120"/>
-          </w:tcPr>
-          <w:p>
-            <w:pPr>
-              <w:spacing w:after="0"/>
-            </w:pPr>
-            <w:r/>
-            <w:r>
-              <w:rPr>
-                <w:sz w:val="19"/>
-              </w:rPr>
-              <w:t>Smoothness of the glow</w:t>
-            </w:r>
-          </w:p>
-        </w:tc>
-        <w:tc>
-          <w:tcPr>
-            <w:tcW w:type="dxa" w:w="3120"/>
-          </w:tcPr>
-          <w:p>
-            <w:pPr>
-              <w:spacing w:after="0"/>
-            </w:pPr>
-            <w:r/>
-            <w:r>
-              <w:rPr>
-                <w:sz w:val="19"/>
-              </w:rPr>
-              <w:t>1 part in 100,000</w:t>
-            </w:r>
-          </w:p>
-        </w:tc>
-        <w:tc>
-          <w:tcPr>
-            <w:tcW w:type="dxa" w:w="3120"/>
-          </w:tcPr>
-          <w:p>
-            <w:pPr>
-              <w:spacing w:after="0"/>
-            </w:pPr>
-            <w:r/>
-            <w:r>
-              <w:rPr>
-                <w:sz w:val="19"/>
-              </w:rPr>
-              <w:t>the seeds of galaxies</w:t>
-            </w:r>
-          </w:p>
-        </w:tc>
-      </w:tr>
-      <w:tr>
-        <w:tc>
-          <w:tcPr>
-            <w:tcW w:type="dxa" w:w="3120"/>
-          </w:tcPr>
-          <w:p>
-            <w:pPr>
-              <w:spacing w:after="0"/>
-            </w:pPr>
-            <w:r/>
-            <w:r>
-              <w:rPr>
-                <w:sz w:val="19"/>
-              </w:rPr>
-              <w:t>Andromeda</w:t>
-            </w:r>
-          </w:p>
-        </w:tc>
-        <w:tc>
-          <w:tcPr>
-            <w:tcW w:type="dxa" w:w="3120"/>
-          </w:tcPr>
-          <w:p>
-            <w:pPr>
-              <w:spacing w:after="0"/>
-            </w:pPr>
-            <w:r/>
-            <w:r>
-              <w:rPr>
-                <w:sz w:val="19"/>
-              </w:rPr>
-              <w:t>about 2.5 million light-years, approaching at about 110 km/s</w:t>
-            </w:r>
-          </w:p>
-        </w:tc>
-        <w:tc>
-          <w:tcPr>
-            <w:tcW w:type="dxa" w:w="3120"/>
-          </w:tcPr>
-          <w:p>
-            <w:pPr>
-              <w:spacing w:after="0"/>
-            </w:pPr>
-            <w:r/>
-            <w:r>
-              <w:rPr>
-                <w:sz w:val="19"/>
-              </w:rPr>
-              <w:t>local pull beating the stretch</w:t>
-            </w:r>
-          </w:p>
-        </w:tc>
-      </w:tr>
-      <w:tr>
-        <w:tc>
-          <w:tcPr>
-            <w:tcW w:type="dxa" w:w="3120"/>
-          </w:tcPr>
-          <w:p>
-            <w:pPr>
-              <w:spacing w:after="0"/>
-            </w:pPr>
-            <w:r/>
-            <w:r>
-              <w:rPr>
-                <w:sz w:val="19"/>
-              </w:rPr>
-              <w:t>Moon’s retreat</w:t>
-            </w:r>
-          </w:p>
-        </w:tc>
-        <w:tc>
-          <w:tcPr>
-            <w:tcW w:type="dxa" w:w="3120"/>
-          </w:tcPr>
-          <w:p>
-            <w:pPr>
-              <w:spacing w:after="0"/>
-            </w:pPr>
-            <w:r/>
-            <w:r>
-              <w:rPr>
-                <w:sz w:val="19"/>
-              </w:rPr>
-              <w:t>about 3.8 cm a year</w:t>
-            </w:r>
-          </w:p>
-        </w:tc>
-        <w:tc>
-          <w:tcPr>
-            <w:tcW w:type="dxa" w:w="3120"/>
-          </w:tcPr>
-          <w:p>
-            <w:pPr>
-              <w:spacing w:after="0"/>
-            </w:pPr>
-            <w:r/>
-            <w:r>
-              <w:rPr>
-                <w:sz w:val="19"/>
-              </w:rPr>
-              <w:t>the tide’s other bill</w:t>
-            </w:r>
-          </w:p>
-        </w:tc>
-      </w:tr>
-    </w:tbl>
+    <w:p>
+      <w:pPr>
+        <w:spacing w:before="0" w:after="100"/>
+      </w:pPr>
+      <w:r>
+        <w:rPr>
+          <w:b/>
+        </w:rPr>
+      </w:r>
+      <w:r>
+        <w:rPr>
+          <w:b/>
+          <w:sz w:val="19"/>
+        </w:rPr>
+        <w:t>Quantity</w:t>
+      </w:r>
+      <w:r>
+        <w:rPr>
+          <w:b/>
+        </w:rPr>
+        <w:t xml:space="preserve"> — </w:t>
+      </w:r>
+      <w:r>
+        <w:rPr>
+          <w:b/>
+        </w:rPr>
+      </w:r>
+      <w:r>
+        <w:rPr>
+          <w:b/>
+          <w:sz w:val="19"/>
+        </w:rPr>
+        <w:t>Value</w:t>
+      </w:r>
+      <w:r>
+        <w:rPr>
+          <w:b/>
+        </w:rPr>
+        <w:t xml:space="preserve"> — </w:t>
+      </w:r>
+      <w:r>
+        <w:rPr>
+          <w:b/>
+        </w:rPr>
+      </w:r>
+      <w:r>
+        <w:rPr>
+          <w:b/>
+          <w:sz w:val="19"/>
+        </w:rPr>
+        <w:t>Where it appears</w:t>
+      </w:r>
+    </w:p>
+    <w:p>
+      <w:pPr>
+        <w:spacing w:before="0" w:after="100"/>
+      </w:pPr>
+      <w:r>
+        <w:rPr>
+          <w:b/>
+        </w:rPr>
+      </w:r>
+      <w:r>
+        <w:rPr>
+          <w:b/>
+          <w:sz w:val="19"/>
+        </w:rPr>
+        <w:t>Ordinary matter</w:t>
+      </w:r>
+      <w:r>
+        <w:br/>
+      </w:r>
+      <w:r>
+        <w:rPr>
+          <w:i/>
+        </w:rPr>
+        <w:t xml:space="preserve">Value: </w:t>
+      </w:r>
+      <w:r>
+        <w:rPr/>
+      </w:r>
+      <w:r>
+        <w:rPr>
+          <w:sz w:val="19"/>
+        </w:rPr>
+        <w:t>about 5 percent</w:t>
+      </w:r>
+      <w:r>
+        <w:br/>
+      </w:r>
+      <w:r>
+        <w:rPr>
+          <w:i/>
+        </w:rPr>
+        <w:t xml:space="preserve">Where it appears: </w:t>
+      </w:r>
+      <w:r>
+        <w:rPr/>
+      </w:r>
+      <w:r>
+        <w:rPr>
+          <w:sz w:val="19"/>
+        </w:rPr>
+        <w:t>stars, gas, planets, people</w:t>
+      </w:r>
+    </w:p>
+    <w:p>
+      <w:pPr>
+        <w:spacing w:before="0" w:after="100"/>
+      </w:pPr>
+      <w:r>
+        <w:rPr>
+          <w:b/>
+        </w:rPr>
+      </w:r>
+      <w:r>
+        <w:rPr>
+          <w:b/>
+          <w:sz w:val="19"/>
+        </w:rPr>
+        <w:t>Dark matter</w:t>
+      </w:r>
+      <w:r>
+        <w:br/>
+      </w:r>
+      <w:r>
+        <w:rPr>
+          <w:i/>
+        </w:rPr>
+        <w:t xml:space="preserve">Value: </w:t>
+      </w:r>
+      <w:r>
+        <w:rPr/>
+      </w:r>
+      <w:r>
+        <w:rPr>
+          <w:sz w:val="19"/>
+        </w:rPr>
+        <w:t>about 27 percent</w:t>
+      </w:r>
+      <w:r>
+        <w:br/>
+      </w:r>
+      <w:r>
+        <w:rPr>
+          <w:i/>
+        </w:rPr>
+        <w:t xml:space="preserve">Where it appears: </w:t>
+      </w:r>
+      <w:r>
+        <w:rPr/>
+      </w:r>
+      <w:r>
+        <w:rPr>
+          <w:sz w:val="19"/>
+        </w:rPr>
+        <w:t>extra bend, no identified owner</w:t>
+      </w:r>
+    </w:p>
+    <w:p>
+      <w:pPr>
+        <w:spacing w:before="0" w:after="100"/>
+      </w:pPr>
+      <w:r>
+        <w:rPr>
+          <w:b/>
+        </w:rPr>
+      </w:r>
+      <w:r>
+        <w:rPr>
+          <w:b/>
+          <w:sz w:val="19"/>
+        </w:rPr>
+        <w:t>Dark energy</w:t>
+      </w:r>
+      <w:r>
+        <w:br/>
+      </w:r>
+      <w:r>
+        <w:rPr>
+          <w:i/>
+        </w:rPr>
+        <w:t xml:space="preserve">Value: </w:t>
+      </w:r>
+      <w:r>
+        <w:rPr/>
+      </w:r>
+      <w:r>
+        <w:rPr>
+          <w:sz w:val="19"/>
+        </w:rPr>
+        <w:t>about 68 percent</w:t>
+      </w:r>
+      <w:r>
+        <w:br/>
+      </w:r>
+      <w:r>
+        <w:rPr>
+          <w:i/>
+        </w:rPr>
+        <w:t xml:space="preserve">Where it appears: </w:t>
+      </w:r>
+      <w:r>
+        <w:rPr/>
+      </w:r>
+      <w:r>
+        <w:rPr>
+          <w:sz w:val="19"/>
+        </w:rPr>
+        <w:t>the label on the speedup</w:t>
+      </w:r>
+    </w:p>
+    <w:p>
+      <w:pPr>
+        <w:spacing w:before="0" w:after="100"/>
+      </w:pPr>
+      <w:r>
+        <w:rPr>
+          <w:b/>
+        </w:rPr>
+      </w:r>
+      <w:r>
+        <w:rPr>
+          <w:b/>
+          <w:sz w:val="19"/>
+        </w:rPr>
+        <w:t>Microwave glow today</w:t>
+      </w:r>
+      <w:r>
+        <w:br/>
+      </w:r>
+      <w:r>
+        <w:rPr>
+          <w:i/>
+        </w:rPr>
+        <w:t xml:space="preserve">Value: </w:t>
+      </w:r>
+      <w:r>
+        <w:rPr/>
+      </w:r>
+      <w:r>
+        <w:rPr>
+          <w:sz w:val="19"/>
+        </w:rPr>
+        <w:t>2.725 K</w:t>
+      </w:r>
+      <w:r>
+        <w:br/>
+      </w:r>
+      <w:r>
+        <w:rPr>
+          <w:i/>
+        </w:rPr>
+        <w:t xml:space="preserve">Where it appears: </w:t>
+      </w:r>
+      <w:r>
+        <w:rPr/>
+      </w:r>
+      <w:r>
+        <w:rPr>
+          <w:sz w:val="19"/>
+        </w:rPr>
+        <w:t>the cooled early light</w:t>
+      </w:r>
+    </w:p>
+    <w:p>
+      <w:pPr>
+        <w:spacing w:before="0" w:after="100"/>
+      </w:pPr>
+      <w:r>
+        <w:rPr>
+          <w:b/>
+        </w:rPr>
+      </w:r>
+      <w:r>
+        <w:rPr>
+          <w:b/>
+          <w:sz w:val="19"/>
+        </w:rPr>
+        <w:t>Smoothness of the glow</w:t>
+      </w:r>
+      <w:r>
+        <w:br/>
+      </w:r>
+      <w:r>
+        <w:rPr>
+          <w:i/>
+        </w:rPr>
+        <w:t xml:space="preserve">Value: </w:t>
+      </w:r>
+      <w:r>
+        <w:rPr/>
+      </w:r>
+      <w:r>
+        <w:rPr>
+          <w:sz w:val="19"/>
+        </w:rPr>
+        <w:t>1 part in 100,000</w:t>
+      </w:r>
+      <w:r>
+        <w:br/>
+      </w:r>
+      <w:r>
+        <w:rPr>
+          <w:i/>
+        </w:rPr>
+        <w:t xml:space="preserve">Where it appears: </w:t>
+      </w:r>
+      <w:r>
+        <w:rPr/>
+      </w:r>
+      <w:r>
+        <w:rPr>
+          <w:sz w:val="19"/>
+        </w:rPr>
+        <w:t>the seeds of galaxies</w:t>
+      </w:r>
+    </w:p>
+    <w:p>
+      <w:pPr>
+        <w:spacing w:before="0" w:after="100"/>
+      </w:pPr>
+      <w:r>
+        <w:rPr>
+          <w:b/>
+        </w:rPr>
+      </w:r>
+      <w:r>
+        <w:rPr>
+          <w:b/>
+          <w:sz w:val="19"/>
+        </w:rPr>
+        <w:t>Andromeda</w:t>
+      </w:r>
+      <w:r>
+        <w:br/>
+      </w:r>
+      <w:r>
+        <w:rPr>
+          <w:i/>
+        </w:rPr>
+        <w:t xml:space="preserve">Value: </w:t>
+      </w:r>
+      <w:r>
+        <w:rPr/>
+      </w:r>
+      <w:r>
+        <w:rPr>
+          <w:sz w:val="19"/>
+        </w:rPr>
+        <w:t>about 2.5 million light-years, approaching at about 110 km/s</w:t>
+      </w:r>
+      <w:r>
+        <w:br/>
+      </w:r>
+      <w:r>
+        <w:rPr>
+          <w:i/>
+        </w:rPr>
+        <w:t xml:space="preserve">Where it appears: </w:t>
+      </w:r>
+      <w:r>
+        <w:rPr/>
+      </w:r>
+      <w:r>
+        <w:rPr>
+          <w:sz w:val="19"/>
+        </w:rPr>
+        <w:t>local pull beating the stretch</w:t>
+      </w:r>
+    </w:p>
+    <w:p>
+      <w:pPr>
+        <w:spacing w:before="0" w:after="100"/>
+      </w:pPr>
+      <w:r>
+        <w:rPr>
+          <w:b/>
+        </w:rPr>
+      </w:r>
+      <w:r>
+        <w:rPr>
+          <w:b/>
+          <w:sz w:val="19"/>
+        </w:rPr>
+        <w:t>Moon’s retreat</w:t>
+      </w:r>
+      <w:r>
+        <w:br/>
+      </w:r>
+      <w:r>
+        <w:rPr>
+          <w:i/>
+        </w:rPr>
+        <w:t xml:space="preserve">Value: </w:t>
+      </w:r>
+      <w:r>
+        <w:rPr/>
+      </w:r>
+      <w:r>
+        <w:rPr>
+          <w:sz w:val="19"/>
+        </w:rPr>
+        <w:t>about 3.8 cm a year</w:t>
+      </w:r>
+      <w:r>
+        <w:br/>
+      </w:r>
+      <w:r>
+        <w:rPr>
+          <w:i/>
+        </w:rPr>
+        <w:t xml:space="preserve">Where it appears: </w:t>
+      </w:r>
+      <w:r>
+        <w:rPr/>
+      </w:r>
+      <w:r>
+        <w:rPr>
+          <w:sz w:val="19"/>
+        </w:rPr>
+        <w:t>the tide’s other bill</w:t>
+      </w:r>
+    </w:p>
     <w:p/>
     <w:p>
       <w:pPr>

</xml_diff>

<commit_message>
No Word tables, part 2: A Trip, The Universe Has No Now, Gravitation, Quantum Vol 1 (per-path from book-2-lectures-after-qed)
</commit_message>
<xml_diff>
--- a/Gravitation, Actually/Gravitation, Actually - Rev8.docx
+++ b/Gravitation, Actually/Gravitation, Actually - Rev8.docx
@@ -14897,937 +14897,48 @@
         <w:t>Worked row, 0.6c. The factor is 1/√(1 − 0.36) = 1/0.8 = 1.25. Two speeds of 0.6c combine to (0.6 + 0.6)/(1 + 0.36) = 0.882c. For a traveler at 0.6c covering 0.6 light-seconds in 1 second, the interval squared is −1 + 0.36 = −0.64 (light-seconds squared): negative, so timelike, and the traveler’s clock reads √0.64 = 0.8 s.</w:t>
       </w:r>
     </w:p>
-    <w:tbl>
-      <w:tblPr>
-        <w:tblStyle w:val="TableGrid"/>
-        <w:tblW w:type="auto" w:w="0"/>
-        <w:tblLook w:firstColumn="1" w:firstRow="1" w:lastColumn="0" w:lastRow="0" w:noHBand="0" w:noVBand="1" w:val="04A0"/>
-      </w:tblPr>
-      <w:tblGrid>
-        <w:gridCol w:w="2340"/>
-        <w:gridCol w:w="2340"/>
-        <w:gridCol w:w="2340"/>
-        <w:gridCol w:w="2340"/>
-      </w:tblGrid>
-      <w:tr>
-        <w:tc>
-          <w:tcPr>
-            <w:tcW w:type="dxa" w:w="2340"/>
-            <w:shd w:val="clear" w:color="auto" w:fill="DCE6F0"/>
-          </w:tcPr>
-          <w:p>
-            <w:pPr>
-              <w:spacing w:after="0"/>
-            </w:pPr>
-            <w:r/>
-            <w:r>
-              <w:rPr>
-                <w:b/>
-                <w:sz w:val="19"/>
-              </w:rPr>
-              <w:t>Speed (fraction of c)</w:t>
-            </w:r>
-          </w:p>
-        </w:tc>
-        <w:tc>
-          <w:tcPr>
-            <w:tcW w:type="dxa" w:w="2340"/>
-            <w:shd w:val="clear" w:color="auto" w:fill="DCE6F0"/>
-          </w:tcPr>
-          <w:p>
-            <w:pPr>
-              <w:spacing w:after="0"/>
-            </w:pPr>
-            <w:r/>
-            <w:r>
-              <w:rPr>
-                <w:b/>
-                <w:sz w:val="19"/>
-              </w:rPr>
-              <w:t>Time factor</w:t>
-            </w:r>
-          </w:p>
-        </w:tc>
-        <w:tc>
-          <w:tcPr>
-            <w:tcW w:type="dxa" w:w="2340"/>
-            <w:shd w:val="clear" w:color="auto" w:fill="DCE6F0"/>
-          </w:tcPr>
-          <w:p>
-            <w:pPr>
-              <w:spacing w:after="0"/>
-            </w:pPr>
-            <w:r/>
-            <w:r>
-              <w:rPr>
-                <w:b/>
-                <w:sz w:val="19"/>
-              </w:rPr>
-              <w:t>Same speed added twice</w:t>
-            </w:r>
-          </w:p>
-        </w:tc>
-        <w:tc>
-          <w:tcPr>
-            <w:tcW w:type="dxa" w:w="2340"/>
-            <w:shd w:val="clear" w:color="auto" w:fill="DCE6F0"/>
-          </w:tcPr>
-          <w:p>
-            <w:pPr>
-              <w:spacing w:after="0"/>
-            </w:pPr>
-            <w:r/>
-            <w:r>
-              <w:rPr>
-                <w:b/>
-                <w:sz w:val="19"/>
-              </w:rPr>
-              <w:t>Interval² for 1 s of travel</w:t>
-            </w:r>
-          </w:p>
-        </w:tc>
-      </w:tr>
-      <w:tr>
-        <w:tc>
-          <w:tcPr>
-            <w:tcW w:type="dxa" w:w="2340"/>
-          </w:tcPr>
-          <w:p>
-            <w:pPr>
-              <w:spacing w:after="0"/>
-            </w:pPr>
-            <w:r/>
-            <w:r>
-              <w:rPr>
-                <w:sz w:val="19"/>
-              </w:rPr>
-              <w:t>0.1</w:t>
-            </w:r>
-          </w:p>
-        </w:tc>
-        <w:tc>
-          <w:tcPr>
-            <w:tcW w:type="dxa" w:w="2340"/>
-          </w:tcPr>
-          <w:p>
-            <w:pPr>
-              <w:spacing w:after="0"/>
-            </w:pPr>
-            <w:r/>
-            <w:r>
-              <w:rPr>
-                <w:sz w:val="19"/>
-              </w:rPr>
-              <w:t>1.005</w:t>
-            </w:r>
-          </w:p>
-        </w:tc>
-        <w:tc>
-          <w:tcPr>
-            <w:tcW w:type="dxa" w:w="2340"/>
-          </w:tcPr>
-          <w:p>
-            <w:pPr>
-              <w:spacing w:after="0"/>
-            </w:pPr>
-            <w:r/>
-            <w:r>
-              <w:rPr>
-                <w:sz w:val="19"/>
-              </w:rPr>
-              <w:t>0.198</w:t>
-            </w:r>
-          </w:p>
-        </w:tc>
-        <w:tc>
-          <w:tcPr>
-            <w:tcW w:type="dxa" w:w="2340"/>
-          </w:tcPr>
-          <w:p>
-            <w:pPr>
-              <w:spacing w:after="0"/>
-            </w:pPr>
-            <w:r/>
-            <w:r>
-              <w:rPr>
-                <w:sz w:val="19"/>
-              </w:rPr>
-              <w:t>−0.99</w:t>
-            </w:r>
-          </w:p>
-        </w:tc>
-      </w:tr>
-      <w:tr>
-        <w:tc>
-          <w:tcPr>
-            <w:tcW w:type="dxa" w:w="2340"/>
-          </w:tcPr>
-          <w:p>
-            <w:pPr>
-              <w:spacing w:after="0"/>
-            </w:pPr>
-            <w:r/>
-            <w:r>
-              <w:rPr>
-                <w:sz w:val="19"/>
-              </w:rPr>
-              <w:t>0.2</w:t>
-            </w:r>
-          </w:p>
-        </w:tc>
-        <w:tc>
-          <w:tcPr>
-            <w:tcW w:type="dxa" w:w="2340"/>
-          </w:tcPr>
-          <w:p>
-            <w:pPr>
-              <w:spacing w:after="0"/>
-            </w:pPr>
-            <w:r/>
-            <w:r>
-              <w:rPr>
-                <w:sz w:val="19"/>
-              </w:rPr>
-              <w:t>1.021</w:t>
-            </w:r>
-          </w:p>
-        </w:tc>
-        <w:tc>
-          <w:tcPr>
-            <w:tcW w:type="dxa" w:w="2340"/>
-          </w:tcPr>
-          <w:p>
-            <w:pPr>
-              <w:spacing w:after="0"/>
-            </w:pPr>
-            <w:r/>
-            <w:r>
-              <w:rPr>
-                <w:sz w:val="19"/>
-              </w:rPr>
-              <w:t>0.385</w:t>
-            </w:r>
-          </w:p>
-        </w:tc>
-        <w:tc>
-          <w:tcPr>
-            <w:tcW w:type="dxa" w:w="2340"/>
-          </w:tcPr>
-          <w:p>
-            <w:pPr>
-              <w:spacing w:after="0"/>
-            </w:pPr>
-            <w:r/>
-            <w:r>
-              <w:rPr>
-                <w:sz w:val="19"/>
-              </w:rPr>
-              <w:t>−0.96</w:t>
-            </w:r>
-          </w:p>
-        </w:tc>
-      </w:tr>
-      <w:tr>
-        <w:tc>
-          <w:tcPr>
-            <w:tcW w:type="dxa" w:w="2340"/>
-          </w:tcPr>
-          <w:p>
-            <w:pPr>
-              <w:spacing w:after="0"/>
-            </w:pPr>
-            <w:r/>
-            <w:r>
-              <w:rPr>
-                <w:sz w:val="19"/>
-              </w:rPr>
-              <w:t>0.3</w:t>
-            </w:r>
-          </w:p>
-        </w:tc>
-        <w:tc>
-          <w:tcPr>
-            <w:tcW w:type="dxa" w:w="2340"/>
-          </w:tcPr>
-          <w:p>
-            <w:pPr>
-              <w:spacing w:after="0"/>
-            </w:pPr>
-            <w:r/>
-            <w:r>
-              <w:rPr>
-                <w:sz w:val="19"/>
-              </w:rPr>
-              <w:t>1.048</w:t>
-            </w:r>
-          </w:p>
-        </w:tc>
-        <w:tc>
-          <w:tcPr>
-            <w:tcW w:type="dxa" w:w="2340"/>
-          </w:tcPr>
-          <w:p>
-            <w:pPr>
-              <w:spacing w:after="0"/>
-            </w:pPr>
-            <w:r/>
-            <w:r>
-              <w:rPr>
-                <w:sz w:val="19"/>
-              </w:rPr>
-              <w:t>0.550</w:t>
-            </w:r>
-          </w:p>
-        </w:tc>
-        <w:tc>
-          <w:tcPr>
-            <w:tcW w:type="dxa" w:w="2340"/>
-          </w:tcPr>
-          <w:p>
-            <w:pPr>
-              <w:spacing w:after="0"/>
-            </w:pPr>
-            <w:r/>
-            <w:r>
-              <w:rPr>
-                <w:sz w:val="19"/>
-              </w:rPr>
-              <w:t>−0.91</w:t>
-            </w:r>
-          </w:p>
-        </w:tc>
-      </w:tr>
-      <w:tr>
-        <w:tc>
-          <w:tcPr>
-            <w:tcW w:type="dxa" w:w="2340"/>
-          </w:tcPr>
-          <w:p>
-            <w:pPr>
-              <w:spacing w:after="0"/>
-            </w:pPr>
-            <w:r/>
-            <w:r>
-              <w:rPr>
-                <w:sz w:val="19"/>
-              </w:rPr>
-              <w:t>0.4</w:t>
-            </w:r>
-          </w:p>
-        </w:tc>
-        <w:tc>
-          <w:tcPr>
-            <w:tcW w:type="dxa" w:w="2340"/>
-          </w:tcPr>
-          <w:p>
-            <w:pPr>
-              <w:spacing w:after="0"/>
-            </w:pPr>
-            <w:r/>
-            <w:r>
-              <w:rPr>
-                <w:sz w:val="19"/>
-              </w:rPr>
-              <w:t>1.091</w:t>
-            </w:r>
-          </w:p>
-        </w:tc>
-        <w:tc>
-          <w:tcPr>
-            <w:tcW w:type="dxa" w:w="2340"/>
-          </w:tcPr>
-          <w:p>
-            <w:pPr>
-              <w:spacing w:after="0"/>
-            </w:pPr>
-            <w:r/>
-            <w:r>
-              <w:rPr>
-                <w:sz w:val="19"/>
-              </w:rPr>
-              <w:t>0.690</w:t>
-            </w:r>
-          </w:p>
-        </w:tc>
-        <w:tc>
-          <w:tcPr>
-            <w:tcW w:type="dxa" w:w="2340"/>
-          </w:tcPr>
-          <w:p>
-            <w:pPr>
-              <w:spacing w:after="0"/>
-            </w:pPr>
-            <w:r/>
-            <w:r>
-              <w:rPr>
-                <w:sz w:val="19"/>
-              </w:rPr>
-              <w:t>−0.84</w:t>
-            </w:r>
-          </w:p>
-        </w:tc>
-      </w:tr>
-      <w:tr>
-        <w:tc>
-          <w:tcPr>
-            <w:tcW w:type="dxa" w:w="2340"/>
-          </w:tcPr>
-          <w:p>
-            <w:pPr>
-              <w:spacing w:after="0"/>
-            </w:pPr>
-            <w:r/>
-            <w:r>
-              <w:rPr>
-                <w:sz w:val="19"/>
-              </w:rPr>
-              <w:t>0.5</w:t>
-            </w:r>
-          </w:p>
-        </w:tc>
-        <w:tc>
-          <w:tcPr>
-            <w:tcW w:type="dxa" w:w="2340"/>
-          </w:tcPr>
-          <w:p>
-            <w:pPr>
-              <w:spacing w:after="0"/>
-            </w:pPr>
-            <w:r/>
-            <w:r>
-              <w:rPr>
-                <w:sz w:val="19"/>
-              </w:rPr>
-              <w:t>1.155</w:t>
-            </w:r>
-          </w:p>
-        </w:tc>
-        <w:tc>
-          <w:tcPr>
-            <w:tcW w:type="dxa" w:w="2340"/>
-          </w:tcPr>
-          <w:p>
-            <w:pPr>
-              <w:spacing w:after="0"/>
-            </w:pPr>
-            <w:r/>
-            <w:r>
-              <w:rPr>
-                <w:sz w:val="19"/>
-              </w:rPr>
-              <w:t>0.800</w:t>
-            </w:r>
-          </w:p>
-        </w:tc>
-        <w:tc>
-          <w:tcPr>
-            <w:tcW w:type="dxa" w:w="2340"/>
-          </w:tcPr>
-          <w:p>
-            <w:pPr>
-              <w:spacing w:after="0"/>
-            </w:pPr>
-            <w:r/>
-            <w:r>
-              <w:rPr>
-                <w:sz w:val="19"/>
-              </w:rPr>
-              <w:t>−0.75</w:t>
-            </w:r>
-          </w:p>
-        </w:tc>
-      </w:tr>
-      <w:tr>
-        <w:tc>
-          <w:tcPr>
-            <w:tcW w:type="dxa" w:w="2340"/>
-          </w:tcPr>
-          <w:p>
-            <w:pPr>
-              <w:spacing w:after="0"/>
-            </w:pPr>
-            <w:r/>
-            <w:r>
-              <w:rPr>
-                <w:sz w:val="19"/>
-              </w:rPr>
-              <w:t>0.6</w:t>
-            </w:r>
-          </w:p>
-        </w:tc>
-        <w:tc>
-          <w:tcPr>
-            <w:tcW w:type="dxa" w:w="2340"/>
-          </w:tcPr>
-          <w:p>
-            <w:pPr>
-              <w:spacing w:after="0"/>
-            </w:pPr>
-            <w:r/>
-            <w:r>
-              <w:rPr>
-                <w:sz w:val="19"/>
-              </w:rPr>
-              <w:t>1.250</w:t>
-            </w:r>
-          </w:p>
-        </w:tc>
-        <w:tc>
-          <w:tcPr>
-            <w:tcW w:type="dxa" w:w="2340"/>
-          </w:tcPr>
-          <w:p>
-            <w:pPr>
-              <w:spacing w:after="0"/>
-            </w:pPr>
-            <w:r/>
-            <w:r>
-              <w:rPr>
-                <w:sz w:val="19"/>
-              </w:rPr>
-              <w:t>0.882</w:t>
-            </w:r>
-          </w:p>
-        </w:tc>
-        <w:tc>
-          <w:tcPr>
-            <w:tcW w:type="dxa" w:w="2340"/>
-          </w:tcPr>
-          <w:p>
-            <w:pPr>
-              <w:spacing w:after="0"/>
-            </w:pPr>
-            <w:r/>
-            <w:r>
-              <w:rPr>
-                <w:sz w:val="19"/>
-              </w:rPr>
-              <w:t>−0.64</w:t>
-            </w:r>
-          </w:p>
-        </w:tc>
-      </w:tr>
-      <w:tr>
-        <w:tc>
-          <w:tcPr>
-            <w:tcW w:type="dxa" w:w="2340"/>
-          </w:tcPr>
-          <w:p>
-            <w:pPr>
-              <w:spacing w:after="0"/>
-            </w:pPr>
-            <w:r/>
-            <w:r>
-              <w:rPr>
-                <w:sz w:val="19"/>
-              </w:rPr>
-              <w:t>0.7</w:t>
-            </w:r>
-          </w:p>
-        </w:tc>
-        <w:tc>
-          <w:tcPr>
-            <w:tcW w:type="dxa" w:w="2340"/>
-          </w:tcPr>
-          <w:p>
-            <w:pPr>
-              <w:spacing w:after="0"/>
-            </w:pPr>
-            <w:r/>
-            <w:r>
-              <w:rPr>
-                <w:sz w:val="19"/>
-              </w:rPr>
-              <w:t>1.400</w:t>
-            </w:r>
-          </w:p>
-        </w:tc>
-        <w:tc>
-          <w:tcPr>
-            <w:tcW w:type="dxa" w:w="2340"/>
-          </w:tcPr>
-          <w:p>
-            <w:pPr>
-              <w:spacing w:after="0"/>
-            </w:pPr>
-            <w:r/>
-            <w:r>
-              <w:rPr>
-                <w:sz w:val="19"/>
-              </w:rPr>
-              <w:t>0.940</w:t>
-            </w:r>
-          </w:p>
-        </w:tc>
-        <w:tc>
-          <w:tcPr>
-            <w:tcW w:type="dxa" w:w="2340"/>
-          </w:tcPr>
-          <w:p>
-            <w:pPr>
-              <w:spacing w:after="0"/>
-            </w:pPr>
-            <w:r/>
-            <w:r>
-              <w:rPr>
-                <w:sz w:val="19"/>
-              </w:rPr>
-              <w:t>−0.51</w:t>
-            </w:r>
-          </w:p>
-        </w:tc>
-      </w:tr>
-      <w:tr>
-        <w:tc>
-          <w:tcPr>
-            <w:tcW w:type="dxa" w:w="2340"/>
-          </w:tcPr>
-          <w:p>
-            <w:pPr>
-              <w:spacing w:after="0"/>
-            </w:pPr>
-            <w:r/>
-            <w:r>
-              <w:rPr>
-                <w:sz w:val="19"/>
-              </w:rPr>
-              <w:t>0.8</w:t>
-            </w:r>
-          </w:p>
-        </w:tc>
-        <w:tc>
-          <w:tcPr>
-            <w:tcW w:type="dxa" w:w="2340"/>
-          </w:tcPr>
-          <w:p>
-            <w:pPr>
-              <w:spacing w:after="0"/>
-            </w:pPr>
-            <w:r/>
-            <w:r>
-              <w:rPr>
-                <w:sz w:val="19"/>
-              </w:rPr>
-              <w:t>1.667</w:t>
-            </w:r>
-          </w:p>
-        </w:tc>
-        <w:tc>
-          <w:tcPr>
-            <w:tcW w:type="dxa" w:w="2340"/>
-          </w:tcPr>
-          <w:p>
-            <w:pPr>
-              <w:spacing w:after="0"/>
-            </w:pPr>
-            <w:r/>
-            <w:r>
-              <w:rPr>
-                <w:sz w:val="19"/>
-              </w:rPr>
-              <w:t>0.976</w:t>
-            </w:r>
-          </w:p>
-        </w:tc>
-        <w:tc>
-          <w:tcPr>
-            <w:tcW w:type="dxa" w:w="2340"/>
-          </w:tcPr>
-          <w:p>
-            <w:pPr>
-              <w:spacing w:after="0"/>
-            </w:pPr>
-            <w:r/>
-            <w:r>
-              <w:rPr>
-                <w:sz w:val="19"/>
-              </w:rPr>
-              <w:t>−0.36</w:t>
-            </w:r>
-          </w:p>
-        </w:tc>
-      </w:tr>
-      <w:tr>
-        <w:tc>
-          <w:tcPr>
-            <w:tcW w:type="dxa" w:w="2340"/>
-          </w:tcPr>
-          <w:p>
-            <w:pPr>
-              <w:spacing w:after="0"/>
-            </w:pPr>
-            <w:r/>
-            <w:r>
-              <w:rPr>
-                <w:sz w:val="19"/>
-              </w:rPr>
-              <w:t>0.9</w:t>
-            </w:r>
-          </w:p>
-        </w:tc>
-        <w:tc>
-          <w:tcPr>
-            <w:tcW w:type="dxa" w:w="2340"/>
-          </w:tcPr>
-          <w:p>
-            <w:pPr>
-              <w:spacing w:after="0"/>
-            </w:pPr>
-            <w:r/>
-            <w:r>
-              <w:rPr>
-                <w:sz w:val="19"/>
-              </w:rPr>
-              <w:t>2.294</w:t>
-            </w:r>
-          </w:p>
-        </w:tc>
-        <w:tc>
-          <w:tcPr>
-            <w:tcW w:type="dxa" w:w="2340"/>
-          </w:tcPr>
-          <w:p>
-            <w:pPr>
-              <w:spacing w:after="0"/>
-            </w:pPr>
-            <w:r/>
-            <w:r>
-              <w:rPr>
-                <w:sz w:val="19"/>
-              </w:rPr>
-              <w:t>0.994</w:t>
-            </w:r>
-          </w:p>
-        </w:tc>
-        <w:tc>
-          <w:tcPr>
-            <w:tcW w:type="dxa" w:w="2340"/>
-          </w:tcPr>
-          <w:p>
-            <w:pPr>
-              <w:spacing w:after="0"/>
-            </w:pPr>
-            <w:r/>
-            <w:r>
-              <w:rPr>
-                <w:sz w:val="19"/>
-              </w:rPr>
-              <w:t>−0.19</w:t>
-            </w:r>
-          </w:p>
-        </w:tc>
-      </w:tr>
-      <w:tr>
-        <w:tc>
-          <w:tcPr>
-            <w:tcW w:type="dxa" w:w="2340"/>
-          </w:tcPr>
-          <w:p>
-            <w:pPr>
-              <w:spacing w:after="0"/>
-            </w:pPr>
-            <w:r/>
-            <w:r>
-              <w:rPr>
-                <w:sz w:val="19"/>
-              </w:rPr>
-              <w:t>0.95</w:t>
-            </w:r>
-          </w:p>
-        </w:tc>
-        <w:tc>
-          <w:tcPr>
-            <w:tcW w:type="dxa" w:w="2340"/>
-          </w:tcPr>
-          <w:p>
-            <w:pPr>
-              <w:spacing w:after="0"/>
-            </w:pPr>
-            <w:r/>
-            <w:r>
-              <w:rPr>
-                <w:sz w:val="19"/>
-              </w:rPr>
-              <w:t>3.203</w:t>
-            </w:r>
-          </w:p>
-        </w:tc>
-        <w:tc>
-          <w:tcPr>
-            <w:tcW w:type="dxa" w:w="2340"/>
-          </w:tcPr>
-          <w:p>
-            <w:pPr>
-              <w:spacing w:after="0"/>
-            </w:pPr>
-            <w:r/>
-            <w:r>
-              <w:rPr>
-                <w:sz w:val="19"/>
-              </w:rPr>
-              <w:t>0.9987</w:t>
-            </w:r>
-          </w:p>
-        </w:tc>
-        <w:tc>
-          <w:tcPr>
-            <w:tcW w:type="dxa" w:w="2340"/>
-          </w:tcPr>
-          <w:p>
-            <w:pPr>
-              <w:spacing w:after="0"/>
-            </w:pPr>
-            <w:r/>
-            <w:r>
-              <w:rPr>
-                <w:sz w:val="19"/>
-              </w:rPr>
-              <w:t>−0.0975</w:t>
-            </w:r>
-          </w:p>
-        </w:tc>
-      </w:tr>
-      <w:tr>
-        <w:tc>
-          <w:tcPr>
-            <w:tcW w:type="dxa" w:w="2340"/>
-          </w:tcPr>
-          <w:p>
-            <w:pPr>
-              <w:spacing w:after="0"/>
-            </w:pPr>
-            <w:r/>
-            <w:r>
-              <w:rPr>
-                <w:sz w:val="19"/>
-              </w:rPr>
-              <w:t>0.99</w:t>
-            </w:r>
-          </w:p>
-        </w:tc>
-        <w:tc>
-          <w:tcPr>
-            <w:tcW w:type="dxa" w:w="2340"/>
-          </w:tcPr>
-          <w:p>
-            <w:pPr>
-              <w:spacing w:after="0"/>
-            </w:pPr>
-            <w:r/>
-            <w:r>
-              <w:rPr>
-                <w:sz w:val="19"/>
-              </w:rPr>
-              <w:t>7.089</w:t>
-            </w:r>
-          </w:p>
-        </w:tc>
-        <w:tc>
-          <w:tcPr>
-            <w:tcW w:type="dxa" w:w="2340"/>
-          </w:tcPr>
-          <w:p>
-            <w:pPr>
-              <w:spacing w:after="0"/>
-            </w:pPr>
-            <w:r/>
-            <w:r>
-              <w:rPr>
-                <w:sz w:val="19"/>
-              </w:rPr>
-              <w:t>0.99995</w:t>
-            </w:r>
-          </w:p>
-        </w:tc>
-        <w:tc>
-          <w:tcPr>
-            <w:tcW w:type="dxa" w:w="2340"/>
-          </w:tcPr>
-          <w:p>
-            <w:pPr>
-              <w:spacing w:after="0"/>
-            </w:pPr>
-            <w:r/>
-            <w:r>
-              <w:rPr>
-                <w:sz w:val="19"/>
-              </w:rPr>
-              <w:t>−0.0199</w:t>
-            </w:r>
-          </w:p>
-        </w:tc>
-      </w:tr>
-      <w:tr>
-        <w:tc>
-          <w:tcPr>
-            <w:tcW w:type="dxa" w:w="2340"/>
-          </w:tcPr>
-          <w:p>
-            <w:pPr>
-              <w:spacing w:after="0"/>
-            </w:pPr>
-            <w:r/>
-            <w:r>
-              <w:rPr>
-                <w:sz w:val="19"/>
-              </w:rPr>
-              <w:t>0.998 (cosmic-ray muons)</w:t>
-            </w:r>
-          </w:p>
-        </w:tc>
-        <w:tc>
-          <w:tcPr>
-            <w:tcW w:type="dxa" w:w="2340"/>
-          </w:tcPr>
-          <w:p>
-            <w:pPr>
-              <w:spacing w:after="0"/>
-            </w:pPr>
-            <w:r/>
-            <w:r>
-              <w:rPr>
-                <w:sz w:val="19"/>
-              </w:rPr>
-              <w:t>15.82</w:t>
-            </w:r>
-          </w:p>
-        </w:tc>
-        <w:tc>
-          <w:tcPr>
-            <w:tcW w:type="dxa" w:w="2340"/>
-          </w:tcPr>
-          <w:p>
-            <w:pPr>
-              <w:spacing w:after="0"/>
-            </w:pPr>
-            <w:r/>
-            <w:r>
-              <w:rPr>
-                <w:sz w:val="19"/>
-              </w:rPr>
-              <w:t>0.999998</w:t>
-            </w:r>
-          </w:p>
-        </w:tc>
-        <w:tc>
-          <w:tcPr>
-            <w:tcW w:type="dxa" w:w="2340"/>
-          </w:tcPr>
-          <w:p>
-            <w:pPr>
-              <w:spacing w:after="0"/>
-            </w:pPr>
-            <w:r/>
-            <w:r>
-              <w:rPr>
-                <w:sz w:val="19"/>
-              </w:rPr>
-              <w:t>−0.0040</w:t>
-            </w:r>
-          </w:p>
-        </w:tc>
-      </w:tr>
-    </w:tbl>
+    <w:p>
+      <w:pPr>
+        <w:jc w:val="center"/>
+        <w:spacing w:before="60" w:after="120"/>
+      </w:pPr>
+      <w:r xmlns:a="http://schemas.openxmlformats.org/drawingml/2006/main" xmlns:pic="http://schemas.openxmlformats.org/drawingml/2006/picture">
+        <w:drawing>
+          <wp:inline distT="0" distB="0" distL="0" distR="0">
+            <wp:extent cx="5486400" cy="3295934"/>
+            <wp:docPr id="2016" name="Table 1" descr="Speed (fraction of c) | Time factor | Same speed added twice | Interval² for 1 s of travel. 0.1 | 1.005 | 0.198 | −0.99. 0.2 | 1.021 | 0.385 | −0.96. 0.3 | 1.048 | 0.550 | −0.91. 0.4 | 1.091 | 0.690 | −0.84. 0.5 | 1.155 | 0.800 | −0.75. 0.6 | 1.250 | 0.882 | −0.64. 0.7 | 1.400 | 0.940 | −0.51. 0.8 | 1.667 | 0.976 | −0.36. 0.9 | 2.294 | 0.994 | −0.19. 0.95 | 3.203 | 0.9987 | −0.0975. 0.99 | 7.089 | 0.99995 | −0.0199. 0.998 (cosmic-ray muons) | 15.82 | 0.999998 | −0.0040"/>
+            <wp:cNvGraphicFramePr>
+              <a:graphicFrameLocks noChangeAspect="1"/>
+            </wp:cNvGraphicFramePr>
+            <a:graphic>
+              <a:graphicData uri="http://schemas.openxmlformats.org/drawingml/2006/picture">
+                <pic:pic>
+                  <pic:nvPicPr>
+                    <pic:cNvPr id="2016" name="Table 1"/>
+                    <pic:cNvPicPr/>
+                  </pic:nvPicPr>
+                  <pic:blipFill>
+                    <a:blip r:embed="rIdTbl1"/>
+                    <a:stretch>
+                      <a:fillRect/>
+                    </a:stretch>
+                  </pic:blipFill>
+                  <pic:spPr>
+                    <a:xfrm>
+                      <a:off x="0" y="0"/>
+                      <a:ext cx="5486400" cy="3295934"/>
+                    </a:xfrm>
+                    <a:prstGeom prst="rect">
+                      <a:avLst/>
+                    </a:prstGeom>
+                  </pic:spPr>
+                </pic:pic>
+              </a:graphicData>
+            </a:graphic>
+          </wp:inline>
+        </w:drawing>
+      </w:r>
+    </w:p>
     <w:p/>
     <w:p>
       <w:pPr>
@@ -15846,552 +14957,48 @@
         <w:t>Worked row, 10 Suns. The horizon radius is 2GM/c². For one Sun, 2GM/c² = 2 × 1,477 m = 2.95 km. For ten Suns, 29.5 km. The radius grows in direct proportion to the mass.</w:t>
       </w:r>
     </w:p>
-    <w:tbl>
-      <w:tblPr>
-        <w:tblStyle w:val="TableGrid"/>
-        <w:tblW w:type="auto" w:w="0"/>
-        <w:tblLook w:firstColumn="1" w:firstRow="1" w:lastColumn="0" w:lastRow="0" w:noHBand="0" w:noVBand="1" w:val="04A0"/>
-      </w:tblPr>
-      <w:tblGrid>
-        <w:gridCol w:w="3120"/>
-        <w:gridCol w:w="3120"/>
-        <w:gridCol w:w="3120"/>
-      </w:tblGrid>
-      <w:tr>
-        <w:tc>
-          <w:tcPr>
-            <w:tcW w:type="dxa" w:w="3120"/>
-            <w:shd w:val="clear" w:color="auto" w:fill="DCE6F0"/>
-          </w:tcPr>
-          <w:p>
-            <w:pPr>
-              <w:spacing w:after="0"/>
-            </w:pPr>
-            <w:r/>
-            <w:r>
-              <w:rPr>
-                <w:b/>
-                <w:sz w:val="19"/>
-              </w:rPr>
-              <w:t>Mass (Suns)</w:t>
-            </w:r>
-          </w:p>
-        </w:tc>
-        <w:tc>
-          <w:tcPr>
-            <w:tcW w:type="dxa" w:w="3120"/>
-            <w:shd w:val="clear" w:color="auto" w:fill="DCE6F0"/>
-          </w:tcPr>
-          <w:p>
-            <w:pPr>
-              <w:spacing w:after="0"/>
-            </w:pPr>
-            <w:r/>
-            <w:r>
-              <w:rPr>
-                <w:b/>
-                <w:sz w:val="19"/>
-              </w:rPr>
-              <w:t>Horizon radius</w:t>
-            </w:r>
-          </w:p>
-        </w:tc>
-        <w:tc>
-          <w:tcPr>
-            <w:tcW w:type="dxa" w:w="3120"/>
-            <w:shd w:val="clear" w:color="auto" w:fill="DCE6F0"/>
-          </w:tcPr>
-          <w:p>
-            <w:pPr>
-              <w:spacing w:after="0"/>
-            </w:pPr>
-            <w:r/>
-            <w:r>
-              <w:rPr>
-                <w:b/>
-                <w:sz w:val="19"/>
-              </w:rPr>
-              <w:t>Example</w:t>
-            </w:r>
-          </w:p>
-        </w:tc>
-      </w:tr>
-      <w:tr>
-        <w:tc>
-          <w:tcPr>
-            <w:tcW w:type="dxa" w:w="3120"/>
-          </w:tcPr>
-          <w:p>
-            <w:pPr>
-              <w:spacing w:after="0"/>
-            </w:pPr>
-            <w:r/>
-            <w:r>
-              <w:rPr>
-                <w:sz w:val="19"/>
-              </w:rPr>
-              <w:t>1</w:t>
-            </w:r>
-          </w:p>
-        </w:tc>
-        <w:tc>
-          <w:tcPr>
-            <w:tcW w:type="dxa" w:w="3120"/>
-          </w:tcPr>
-          <w:p>
-            <w:pPr>
-              <w:spacing w:after="0"/>
-            </w:pPr>
-            <w:r/>
-            <w:r>
-              <w:rPr>
-                <w:sz w:val="19"/>
-              </w:rPr>
-              <w:t>2.95 km</w:t>
-            </w:r>
-          </w:p>
-        </w:tc>
-        <w:tc>
-          <w:tcPr>
-            <w:tcW w:type="dxa" w:w="3120"/>
-          </w:tcPr>
-          <w:p>
-            <w:pPr>
-              <w:spacing w:after="0"/>
-            </w:pPr>
-            <w:r/>
-            <w:r>
-              <w:rPr>
-                <w:sz w:val="19"/>
-              </w:rPr>
-              <w:t>the Sun, as a comparison</w:t>
-            </w:r>
-          </w:p>
-        </w:tc>
-      </w:tr>
-      <w:tr>
-        <w:tc>
-          <w:tcPr>
-            <w:tcW w:type="dxa" w:w="3120"/>
-          </w:tcPr>
-          <w:p>
-            <w:pPr>
-              <w:spacing w:after="0"/>
-            </w:pPr>
-            <w:r/>
-            <w:r>
-              <w:rPr>
-                <w:sz w:val="19"/>
-              </w:rPr>
-              <w:t>3</w:t>
-            </w:r>
-          </w:p>
-        </w:tc>
-        <w:tc>
-          <w:tcPr>
-            <w:tcW w:type="dxa" w:w="3120"/>
-          </w:tcPr>
-          <w:p>
-            <w:pPr>
-              <w:spacing w:after="0"/>
-            </w:pPr>
-            <w:r/>
-            <w:r>
-              <w:rPr>
-                <w:sz w:val="19"/>
-              </w:rPr>
-              <w:t>8.9 km</w:t>
-            </w:r>
-          </w:p>
-        </w:tc>
-        <w:tc>
-          <w:tcPr>
-            <w:tcW w:type="dxa" w:w="3120"/>
-          </w:tcPr>
-          <w:p>
-            <w:pPr>
-              <w:spacing w:after="0"/>
-            </w:pPr>
-            <w:r/>
-            <w:r>
-              <w:rPr>
-                <w:sz w:val="19"/>
-              </w:rPr>
-              <w:t>just past the heaviest neutron stars</w:t>
-            </w:r>
-          </w:p>
-        </w:tc>
-      </w:tr>
-      <w:tr>
-        <w:tc>
-          <w:tcPr>
-            <w:tcW w:type="dxa" w:w="3120"/>
-          </w:tcPr>
-          <w:p>
-            <w:pPr>
-              <w:spacing w:after="0"/>
-            </w:pPr>
-            <w:r/>
-            <w:r>
-              <w:rPr>
-                <w:sz w:val="19"/>
-              </w:rPr>
-              <w:t>10</w:t>
-            </w:r>
-          </w:p>
-        </w:tc>
-        <w:tc>
-          <w:tcPr>
-            <w:tcW w:type="dxa" w:w="3120"/>
-          </w:tcPr>
-          <w:p>
-            <w:pPr>
-              <w:spacing w:after="0"/>
-            </w:pPr>
-            <w:r/>
-            <w:r>
-              <w:rPr>
-                <w:sz w:val="19"/>
-              </w:rPr>
-              <w:t>29.5 km</w:t>
-            </w:r>
-          </w:p>
-        </w:tc>
-        <w:tc>
-          <w:tcPr>
-            <w:tcW w:type="dxa" w:w="3120"/>
-          </w:tcPr>
-          <w:p>
-            <w:pPr>
-              <w:spacing w:after="0"/>
-            </w:pPr>
-            <w:r/>
-            <w:r>
-              <w:rPr>
-                <w:sz w:val="19"/>
-              </w:rPr>
-              <w:t>a typical stellar black hole</w:t>
-            </w:r>
-          </w:p>
-        </w:tc>
-      </w:tr>
-      <w:tr>
-        <w:tc>
-          <w:tcPr>
-            <w:tcW w:type="dxa" w:w="3120"/>
-          </w:tcPr>
-          <w:p>
-            <w:pPr>
-              <w:spacing w:after="0"/>
-            </w:pPr>
-            <w:r/>
-            <w:r>
-              <w:rPr>
-                <w:sz w:val="19"/>
-              </w:rPr>
-              <w:t>36</w:t>
-            </w:r>
-          </w:p>
-        </w:tc>
-        <w:tc>
-          <w:tcPr>
-            <w:tcW w:type="dxa" w:w="3120"/>
-          </w:tcPr>
-          <w:p>
-            <w:pPr>
-              <w:spacing w:after="0"/>
-            </w:pPr>
-            <w:r/>
-            <w:r>
-              <w:rPr>
-                <w:sz w:val="19"/>
-              </w:rPr>
-              <w:t>106 km</w:t>
-            </w:r>
-          </w:p>
-        </w:tc>
-        <w:tc>
-          <w:tcPr>
-            <w:tcW w:type="dxa" w:w="3120"/>
-          </w:tcPr>
-          <w:p>
-            <w:pPr>
-              <w:spacing w:after="0"/>
-            </w:pPr>
-            <w:r/>
-            <w:r>
-              <w:rPr>
-                <w:sz w:val="19"/>
-              </w:rPr>
-              <w:t>the heavier hole in GW150914</w:t>
-            </w:r>
-          </w:p>
-        </w:tc>
-      </w:tr>
-      <w:tr>
-        <w:tc>
-          <w:tcPr>
-            <w:tcW w:type="dxa" w:w="3120"/>
-          </w:tcPr>
-          <w:p>
-            <w:pPr>
-              <w:spacing w:after="0"/>
-            </w:pPr>
-            <w:r/>
-            <w:r>
-              <w:rPr>
-                <w:sz w:val="19"/>
-              </w:rPr>
-              <w:t>62</w:t>
-            </w:r>
-          </w:p>
-        </w:tc>
-        <w:tc>
-          <w:tcPr>
-            <w:tcW w:type="dxa" w:w="3120"/>
-          </w:tcPr>
-          <w:p>
-            <w:pPr>
-              <w:spacing w:after="0"/>
-            </w:pPr>
-            <w:r/>
-            <w:r>
-              <w:rPr>
-                <w:sz w:val="19"/>
-              </w:rPr>
-              <w:t>183 km</w:t>
-            </w:r>
-          </w:p>
-        </w:tc>
-        <w:tc>
-          <w:tcPr>
-            <w:tcW w:type="dxa" w:w="3120"/>
-          </w:tcPr>
-          <w:p>
-            <w:pPr>
-              <w:spacing w:after="0"/>
-            </w:pPr>
-            <w:r/>
-            <w:r>
-              <w:rPr>
-                <w:sz w:val="19"/>
-              </w:rPr>
-              <w:t>the hole GW150914 left behind</w:t>
-            </w:r>
-          </w:p>
-        </w:tc>
-      </w:tr>
-      <w:tr>
-        <w:tc>
-          <w:tcPr>
-            <w:tcW w:type="dxa" w:w="3120"/>
-          </w:tcPr>
-          <w:p>
-            <w:pPr>
-              <w:spacing w:after="0"/>
-            </w:pPr>
-            <w:r/>
-            <w:r>
-              <w:rPr>
-                <w:sz w:val="19"/>
-              </w:rPr>
-              <w:t>100</w:t>
-            </w:r>
-          </w:p>
-        </w:tc>
-        <w:tc>
-          <w:tcPr>
-            <w:tcW w:type="dxa" w:w="3120"/>
-          </w:tcPr>
-          <w:p>
-            <w:pPr>
-              <w:spacing w:after="0"/>
-            </w:pPr>
-            <w:r/>
-            <w:r>
-              <w:rPr>
-                <w:sz w:val="19"/>
-              </w:rPr>
-              <w:t>295 km</w:t>
-            </w:r>
-          </w:p>
-        </w:tc>
-        <w:tc>
-          <w:tcPr>
-            <w:tcW w:type="dxa" w:w="3120"/>
-          </w:tcPr>
-          <w:p>
-            <w:pPr>
-              <w:spacing w:after="0"/>
-            </w:pPr>
-            <w:r/>
-            <w:r>
-              <w:rPr>
-                <w:sz w:val="19"/>
-              </w:rPr>
-            </w:r>
-          </w:p>
-        </w:tc>
-      </w:tr>
-      <w:tr>
-        <w:tc>
-          <w:tcPr>
-            <w:tcW w:type="dxa" w:w="3120"/>
-          </w:tcPr>
-          <w:p>
-            <w:pPr>
-              <w:spacing w:after="0"/>
-            </w:pPr>
-            <w:r/>
-            <w:r>
-              <w:rPr>
-                <w:sz w:val="19"/>
-              </w:rPr>
-              <w:t>1,000</w:t>
-            </w:r>
-          </w:p>
-        </w:tc>
-        <w:tc>
-          <w:tcPr>
-            <w:tcW w:type="dxa" w:w="3120"/>
-          </w:tcPr>
-          <w:p>
-            <w:pPr>
-              <w:spacing w:after="0"/>
-            </w:pPr>
-            <w:r/>
-            <w:r>
-              <w:rPr>
-                <w:sz w:val="19"/>
-              </w:rPr>
-              <w:t>2,950 km</w:t>
-            </w:r>
-          </w:p>
-        </w:tc>
-        <w:tc>
-          <w:tcPr>
-            <w:tcW w:type="dxa" w:w="3120"/>
-          </w:tcPr>
-          <w:p>
-            <w:pPr>
-              <w:spacing w:after="0"/>
-            </w:pPr>
-            <w:r/>
-            <w:r>
-              <w:rPr>
-                <w:sz w:val="19"/>
-              </w:rPr>
-            </w:r>
-          </w:p>
-        </w:tc>
-      </w:tr>
-      <w:tr>
-        <w:tc>
-          <w:tcPr>
-            <w:tcW w:type="dxa" w:w="3120"/>
-          </w:tcPr>
-          <w:p>
-            <w:pPr>
-              <w:spacing w:after="0"/>
-            </w:pPr>
-            <w:r/>
-            <w:r>
-              <w:rPr>
-                <w:sz w:val="19"/>
-              </w:rPr>
-              <w:t>4.3 million</w:t>
-            </w:r>
-          </w:p>
-        </w:tc>
-        <w:tc>
-          <w:tcPr>
-            <w:tcW w:type="dxa" w:w="3120"/>
-          </w:tcPr>
-          <w:p>
-            <w:pPr>
-              <w:spacing w:after="0"/>
-            </w:pPr>
-            <w:r/>
-            <w:r>
-              <w:rPr>
-                <w:sz w:val="19"/>
-              </w:rPr>
-              <w:t>12.7 million km (0.085 AU)</w:t>
-            </w:r>
-          </w:p>
-        </w:tc>
-        <w:tc>
-          <w:tcPr>
-            <w:tcW w:type="dxa" w:w="3120"/>
-          </w:tcPr>
-          <w:p>
-            <w:pPr>
-              <w:spacing w:after="0"/>
-            </w:pPr>
-            <w:r/>
-            <w:r>
-              <w:rPr>
-                <w:sz w:val="19"/>
-              </w:rPr>
-              <w:t>Sgr A*, the center of the Milky Way</w:t>
-            </w:r>
-          </w:p>
-        </w:tc>
-      </w:tr>
-      <w:tr>
-        <w:tc>
-          <w:tcPr>
-            <w:tcW w:type="dxa" w:w="3120"/>
-          </w:tcPr>
-          <w:p>
-            <w:pPr>
-              <w:spacing w:after="0"/>
-            </w:pPr>
-            <w:r/>
-            <w:r>
-              <w:rPr>
-                <w:sz w:val="19"/>
-              </w:rPr>
-              <w:t>6.5 billion</w:t>
-            </w:r>
-          </w:p>
-        </w:tc>
-        <w:tc>
-          <w:tcPr>
-            <w:tcW w:type="dxa" w:w="3120"/>
-          </w:tcPr>
-          <w:p>
-            <w:pPr>
-              <w:spacing w:after="0"/>
-            </w:pPr>
-            <w:r/>
-            <w:r>
-              <w:rPr>
-                <w:sz w:val="19"/>
-              </w:rPr>
-              <w:t>19.2 billion km (128 AU)</w:t>
-            </w:r>
-          </w:p>
-        </w:tc>
-        <w:tc>
-          <w:tcPr>
-            <w:tcW w:type="dxa" w:w="3120"/>
-          </w:tcPr>
-          <w:p>
-            <w:pPr>
-              <w:spacing w:after="0"/>
-            </w:pPr>
-            <w:r/>
-            <w:r>
-              <w:rPr>
-                <w:sz w:val="19"/>
-              </w:rPr>
-              <w:t>M87*</w:t>
-            </w:r>
-          </w:p>
-        </w:tc>
-      </w:tr>
-    </w:tbl>
+    <w:p>
+      <w:pPr>
+        <w:jc w:val="center"/>
+        <w:spacing w:before="60" w:after="120"/>
+      </w:pPr>
+      <w:r xmlns:a="http://schemas.openxmlformats.org/drawingml/2006/main" xmlns:pic="http://schemas.openxmlformats.org/drawingml/2006/picture">
+        <w:drawing>
+          <wp:inline distT="0" distB="0" distL="0" distR="0">
+            <wp:extent cx="5486400" cy="2961564"/>
+            <wp:docPr id="2017" name="Table 2" descr="Mass (Suns) | Horizon radius | Example. 1 | 2.95 km | the Sun, as a comparison. 3 | 8.9 km | just past the heaviest neutron stars. 10 | 29.5 km | a typical stellar black hole. 36 | 106 km | the heavier hole in GW150914. 62 | 183 km | the hole GW150914 left behind. 100 | 295 km. 1,000 | 2,950 km. 4.3 million | 12.7 million km (0.085 AU) | Sgr A*, the center of the Milky Way. 6.5 billion | 19.2 billion km (128 AU) | M87*"/>
+            <wp:cNvGraphicFramePr>
+              <a:graphicFrameLocks noChangeAspect="1"/>
+            </wp:cNvGraphicFramePr>
+            <a:graphic>
+              <a:graphicData uri="http://schemas.openxmlformats.org/drawingml/2006/picture">
+                <pic:pic>
+                  <pic:nvPicPr>
+                    <pic:cNvPr id="2017" name="Table 2"/>
+                    <pic:cNvPicPr/>
+                  </pic:nvPicPr>
+                  <pic:blipFill>
+                    <a:blip r:embed="rIdTbl2"/>
+                    <a:stretch>
+                      <a:fillRect/>
+                    </a:stretch>
+                  </pic:blipFill>
+                  <pic:spPr>
+                    <a:xfrm>
+                      <a:off x="0" y="0"/>
+                      <a:ext cx="5486400" cy="2961564"/>
+                    </a:xfrm>
+                    <a:prstGeom prst="rect">
+                      <a:avLst/>
+                    </a:prstGeom>
+                  </pic:spPr>
+                </pic:pic>
+              </a:graphicData>
+            </a:graphic>
+          </wp:inline>
+        </w:drawing>
+      </w:r>
+    </w:p>
     <w:p/>
     <w:p>
       <w:pPr>
@@ -16410,447 +15017,48 @@
         <w:t>Worked row, a GPS satellite. The height term is (GM/c²)(1/R − 1/r), with GM/c² = 4.435 mm for the Earth, R = 6,371 km, and r = 6,371 + 20,200 = 26,571 km. That is 5.29 × 10⁻¹⁰, or 45.7 µs a day. For an orbit, subtract the speed term v²/2c², which is 7.2 µs a day at GPS speed. For a tower or a mountain, gh/c² gives the same answer as the exact formula. For an orbit it does not, because g weakens with height.</w:t>
       </w:r>
     </w:p>
-    <w:tbl>
-      <w:tblPr>
-        <w:tblStyle w:val="TableGrid"/>
-        <w:tblW w:type="auto" w:w="0"/>
-        <w:tblLook w:firstColumn="1" w:firstRow="1" w:lastColumn="0" w:lastRow="0" w:noHBand="0" w:noVBand="1" w:val="04A0"/>
-      </w:tblPr>
-      <w:tblGrid>
-        <w:gridCol w:w="2340"/>
-        <w:gridCol w:w="2340"/>
-        <w:gridCol w:w="2340"/>
-        <w:gridCol w:w="2340"/>
-      </w:tblGrid>
-      <w:tr>
-        <w:tc>
-          <w:tcPr>
-            <w:tcW w:type="dxa" w:w="2340"/>
-            <w:shd w:val="clear" w:color="auto" w:fill="DCE6F0"/>
-          </w:tcPr>
-          <w:p>
-            <w:pPr>
-              <w:spacing w:after="0"/>
-            </w:pPr>
-            <w:r/>
-            <w:r>
-              <w:rPr>
-                <w:b/>
-                <w:sz w:val="19"/>
-              </w:rPr>
-              <w:t>Place (height)</w:t>
-            </w:r>
-          </w:p>
-        </w:tc>
-        <w:tc>
-          <w:tcPr>
-            <w:tcW w:type="dxa" w:w="2340"/>
-            <w:shd w:val="clear" w:color="auto" w:fill="DCE6F0"/>
-          </w:tcPr>
-          <w:p>
-            <w:pPr>
-              <w:spacing w:after="0"/>
-            </w:pPr>
-            <w:r/>
-            <w:r>
-              <w:rPr>
-                <w:b/>
-                <w:sz w:val="19"/>
-              </w:rPr>
-              <w:t>Height term, µs/day</w:t>
-            </w:r>
-          </w:p>
-        </w:tc>
-        <w:tc>
-          <w:tcPr>
-            <w:tcW w:type="dxa" w:w="2340"/>
-            <w:shd w:val="clear" w:color="auto" w:fill="DCE6F0"/>
-          </w:tcPr>
-          <w:p>
-            <w:pPr>
-              <w:spacing w:after="0"/>
-            </w:pPr>
-            <w:r/>
-            <w:r>
-              <w:rPr>
-                <w:b/>
-                <w:sz w:val="19"/>
-              </w:rPr>
-              <w:t>Speed term, µs/day</w:t>
-            </w:r>
-          </w:p>
-        </w:tc>
-        <w:tc>
-          <w:tcPr>
-            <w:tcW w:type="dxa" w:w="2340"/>
-            <w:shd w:val="clear" w:color="auto" w:fill="DCE6F0"/>
-          </w:tcPr>
-          <w:p>
-            <w:pPr>
-              <w:spacing w:after="0"/>
-            </w:pPr>
-            <w:r/>
-            <w:r>
-              <w:rPr>
-                <w:b/>
-                <w:sz w:val="19"/>
-              </w:rPr>
-              <w:t>Net vs ground, µs/day</w:t>
-            </w:r>
-          </w:p>
-        </w:tc>
-      </w:tr>
-      <w:tr>
-        <w:tc>
-          <w:tcPr>
-            <w:tcW w:type="dxa" w:w="2340"/>
-          </w:tcPr>
-          <w:p>
-            <w:pPr>
-              <w:spacing w:after="0"/>
-            </w:pPr>
-            <w:r/>
-            <w:r>
-              <w:rPr>
-                <w:sz w:val="19"/>
-              </w:rPr>
-              <w:t>Harvard tower (22.5 m)</w:t>
-            </w:r>
-          </w:p>
-        </w:tc>
-        <w:tc>
-          <w:tcPr>
-            <w:tcW w:type="dxa" w:w="2340"/>
-          </w:tcPr>
-          <w:p>
-            <w:pPr>
-              <w:spacing w:after="0"/>
-            </w:pPr>
-            <w:r/>
-            <w:r>
-              <w:rPr>
-                <w:sz w:val="19"/>
-              </w:rPr>
-              <w:t>+0.000212</w:t>
-            </w:r>
-          </w:p>
-        </w:tc>
-        <w:tc>
-          <w:tcPr>
-            <w:tcW w:type="dxa" w:w="2340"/>
-          </w:tcPr>
-          <w:p>
-            <w:pPr>
-              <w:spacing w:after="0"/>
-            </w:pPr>
-            <w:r/>
-            <w:r>
-              <w:rPr>
-                <w:sz w:val="19"/>
-              </w:rPr>
-              <w:t>0</w:t>
-            </w:r>
-          </w:p>
-        </w:tc>
-        <w:tc>
-          <w:tcPr>
-            <w:tcW w:type="dxa" w:w="2340"/>
-          </w:tcPr>
-          <w:p>
-            <w:pPr>
-              <w:spacing w:after="0"/>
-            </w:pPr>
-            <w:r/>
-            <w:r>
-              <w:rPr>
-                <w:sz w:val="19"/>
-              </w:rPr>
-              <w:t>+0.000212</w:t>
-            </w:r>
-          </w:p>
-        </w:tc>
-      </w:tr>
-      <w:tr>
-        <w:tc>
-          <w:tcPr>
-            <w:tcW w:type="dxa" w:w="2340"/>
-          </w:tcPr>
-          <w:p>
-            <w:pPr>
-              <w:spacing w:after="0"/>
-            </w:pPr>
-            <w:r/>
-            <w:r>
-              <w:rPr>
-                <w:sz w:val="19"/>
-              </w:rPr>
-              <w:t>Mount Everest (8.8 km)</w:t>
-            </w:r>
-          </w:p>
-        </w:tc>
-        <w:tc>
-          <w:tcPr>
-            <w:tcW w:type="dxa" w:w="2340"/>
-          </w:tcPr>
-          <w:p>
-            <w:pPr>
-              <w:spacing w:after="0"/>
-            </w:pPr>
-            <w:r/>
-            <w:r>
-              <w:rPr>
-                <w:sz w:val="19"/>
-              </w:rPr>
-              <w:t>+0.083</w:t>
-            </w:r>
-          </w:p>
-        </w:tc>
-        <w:tc>
-          <w:tcPr>
-            <w:tcW w:type="dxa" w:w="2340"/>
-          </w:tcPr>
-          <w:p>
-            <w:pPr>
-              <w:spacing w:after="0"/>
-            </w:pPr>
-            <w:r/>
-            <w:r>
-              <w:rPr>
-                <w:sz w:val="19"/>
-              </w:rPr>
-              <w:t>0</w:t>
-            </w:r>
-          </w:p>
-        </w:tc>
-        <w:tc>
-          <w:tcPr>
-            <w:tcW w:type="dxa" w:w="2340"/>
-          </w:tcPr>
-          <w:p>
-            <w:pPr>
-              <w:spacing w:after="0"/>
-            </w:pPr>
-            <w:r/>
-            <w:r>
-              <w:rPr>
-                <w:sz w:val="19"/>
-              </w:rPr>
-              <w:t>+0.083</w:t>
-            </w:r>
-          </w:p>
-        </w:tc>
-      </w:tr>
-      <w:tr>
-        <w:tc>
-          <w:tcPr>
-            <w:tcW w:type="dxa" w:w="2340"/>
-          </w:tcPr>
-          <w:p>
-            <w:pPr>
-              <w:spacing w:after="0"/>
-            </w:pPr>
-            <w:r/>
-            <w:r>
-              <w:rPr>
-                <w:sz w:val="19"/>
-              </w:rPr>
-              <w:t>Space station (400 km)</w:t>
-            </w:r>
-          </w:p>
-        </w:tc>
-        <w:tc>
-          <w:tcPr>
-            <w:tcW w:type="dxa" w:w="2340"/>
-          </w:tcPr>
-          <w:p>
-            <w:pPr>
-              <w:spacing w:after="0"/>
-            </w:pPr>
-            <w:r/>
-            <w:r>
-              <w:rPr>
-                <w:sz w:val="19"/>
-              </w:rPr>
-              <w:t>+3.6</w:t>
-            </w:r>
-          </w:p>
-        </w:tc>
-        <w:tc>
-          <w:tcPr>
-            <w:tcW w:type="dxa" w:w="2340"/>
-          </w:tcPr>
-          <w:p>
-            <w:pPr>
-              <w:spacing w:after="0"/>
-            </w:pPr>
-            <w:r/>
-            <w:r>
-              <w:rPr>
-                <w:sz w:val="19"/>
-              </w:rPr>
-              <w:t>−28.3</w:t>
-            </w:r>
-          </w:p>
-        </w:tc>
-        <w:tc>
-          <w:tcPr>
-            <w:tcW w:type="dxa" w:w="2340"/>
-          </w:tcPr>
-          <w:p>
-            <w:pPr>
-              <w:spacing w:after="0"/>
-            </w:pPr>
-            <w:r/>
-            <w:r>
-              <w:rPr>
-                <w:sz w:val="19"/>
-              </w:rPr>
-              <w:t>−24.7</w:t>
-            </w:r>
-          </w:p>
-        </w:tc>
-      </w:tr>
-      <w:tr>
-        <w:tc>
-          <w:tcPr>
-            <w:tcW w:type="dxa" w:w="2340"/>
-          </w:tcPr>
-          <w:p>
-            <w:pPr>
-              <w:spacing w:after="0"/>
-            </w:pPr>
-            <w:r/>
-            <w:r>
-              <w:rPr>
-                <w:sz w:val="19"/>
-              </w:rPr>
-              <w:t>GPS satellite (20,200 km)</w:t>
-            </w:r>
-          </w:p>
-        </w:tc>
-        <w:tc>
-          <w:tcPr>
-            <w:tcW w:type="dxa" w:w="2340"/>
-          </w:tcPr>
-          <w:p>
-            <w:pPr>
-              <w:spacing w:after="0"/>
-            </w:pPr>
-            <w:r/>
-            <w:r>
-              <w:rPr>
-                <w:sz w:val="19"/>
-              </w:rPr>
-              <w:t>+45.7</w:t>
-            </w:r>
-          </w:p>
-        </w:tc>
-        <w:tc>
-          <w:tcPr>
-            <w:tcW w:type="dxa" w:w="2340"/>
-          </w:tcPr>
-          <w:p>
-            <w:pPr>
-              <w:spacing w:after="0"/>
-            </w:pPr>
-            <w:r/>
-            <w:r>
-              <w:rPr>
-                <w:sz w:val="19"/>
-              </w:rPr>
-              <w:t>−7.2</w:t>
-            </w:r>
-          </w:p>
-        </w:tc>
-        <w:tc>
-          <w:tcPr>
-            <w:tcW w:type="dxa" w:w="2340"/>
-          </w:tcPr>
-          <w:p>
-            <w:pPr>
-              <w:spacing w:after="0"/>
-            </w:pPr>
-            <w:r/>
-            <w:r>
-              <w:rPr>
-                <w:sz w:val="19"/>
-              </w:rPr>
-              <w:t>+38.5</w:t>
-            </w:r>
-          </w:p>
-        </w:tc>
-      </w:tr>
-      <w:tr>
-        <w:tc>
-          <w:tcPr>
-            <w:tcW w:type="dxa" w:w="2340"/>
-          </w:tcPr>
-          <w:p>
-            <w:pPr>
-              <w:spacing w:after="0"/>
-            </w:pPr>
-            <w:r/>
-            <w:r>
-              <w:rPr>
-                <w:sz w:val="19"/>
-              </w:rPr>
-              <w:t>Geostationary (35,786 km)</w:t>
-            </w:r>
-          </w:p>
-        </w:tc>
-        <w:tc>
-          <w:tcPr>
-            <w:tcW w:type="dxa" w:w="2340"/>
-          </w:tcPr>
-          <w:p>
-            <w:pPr>
-              <w:spacing w:after="0"/>
-            </w:pPr>
-            <w:r/>
-            <w:r>
-              <w:rPr>
-                <w:sz w:val="19"/>
-              </w:rPr>
-              <w:t>+51.1</w:t>
-            </w:r>
-          </w:p>
-        </w:tc>
-        <w:tc>
-          <w:tcPr>
-            <w:tcW w:type="dxa" w:w="2340"/>
-          </w:tcPr>
-          <w:p>
-            <w:pPr>
-              <w:spacing w:after="0"/>
-            </w:pPr>
-            <w:r/>
-            <w:r>
-              <w:rPr>
-                <w:sz w:val="19"/>
-              </w:rPr>
-              <w:t>−4.5</w:t>
-            </w:r>
-          </w:p>
-        </w:tc>
-        <w:tc>
-          <w:tcPr>
-            <w:tcW w:type="dxa" w:w="2340"/>
-          </w:tcPr>
-          <w:p>
-            <w:pPr>
-              <w:spacing w:after="0"/>
-            </w:pPr>
-            <w:r/>
-            <w:r>
-              <w:rPr>
-                <w:sz w:val="19"/>
-              </w:rPr>
-              <w:t>+46.5</w:t>
-            </w:r>
-          </w:p>
-        </w:tc>
-      </w:tr>
-    </w:tbl>
+    <w:p>
+      <w:pPr>
+        <w:jc w:val="center"/>
+        <w:spacing w:before="60" w:after="120"/>
+      </w:pPr>
+      <w:r xmlns:a="http://schemas.openxmlformats.org/drawingml/2006/main" xmlns:pic="http://schemas.openxmlformats.org/drawingml/2006/picture">
+        <w:drawing>
+          <wp:inline distT="0" distB="0" distL="0" distR="0">
+            <wp:extent cx="5486400" cy="2402005"/>
+            <wp:docPr id="2018" name="Table 3" descr="Place (height) | Height term, µs/day | Speed term, µs/day | Net vs ground, µs/day. Harvard tower (22.5 m) | +0.000212 | 0 | +0.000212. Mount Everest (8.8 km) | +0.083 | 0 | +0.083. Space station (400 km) | +3.6 | −28.3 | −24.7. GPS satellite (20,200 km) | +45.7 | −7.2 | +38.5. Geostationary (35,786 km) | +51.1 | −4.5 | +46.5"/>
+            <wp:cNvGraphicFramePr>
+              <a:graphicFrameLocks noChangeAspect="1"/>
+            </wp:cNvGraphicFramePr>
+            <a:graphic>
+              <a:graphicData uri="http://schemas.openxmlformats.org/drawingml/2006/picture">
+                <pic:pic>
+                  <pic:nvPicPr>
+                    <pic:cNvPr id="2018" name="Table 3"/>
+                    <pic:cNvPicPr/>
+                  </pic:nvPicPr>
+                  <pic:blipFill>
+                    <a:blip r:embed="rIdTbl3"/>
+                    <a:stretch>
+                      <a:fillRect/>
+                    </a:stretch>
+                  </pic:blipFill>
+                  <pic:spPr>
+                    <a:xfrm>
+                      <a:off x="0" y="0"/>
+                      <a:ext cx="5486400" cy="2402005"/>
+                    </a:xfrm>
+                    <a:prstGeom prst="rect">
+                      <a:avLst/>
+                    </a:prstGeom>
+                  </pic:spPr>
+                </pic:pic>
+              </a:graphicData>
+            </a:graphic>
+          </wp:inline>
+        </w:drawing>
+      </w:r>
+    </w:p>
     <w:p/>
     <w:p>
       <w:r>
@@ -16869,448 +15077,430 @@
       </w:r>
       <w:bookmarkEnd w:id="112"/>
     </w:p>
-    <w:tbl>
-      <w:tblPr>
-        <w:tblStyle w:val="TableGrid"/>
-        <w:tblW w:type="auto" w:w="0"/>
-        <w:tblLook w:firstColumn="1" w:firstRow="1" w:lastColumn="0" w:lastRow="0" w:noHBand="0" w:noVBand="1" w:val="04A0"/>
-      </w:tblPr>
-      <w:tblGrid>
-        <w:gridCol w:w="3120"/>
-        <w:gridCol w:w="3120"/>
-        <w:gridCol w:w="3120"/>
-      </w:tblGrid>
-      <w:tr>
-        <w:tc>
-          <w:tcPr>
-            <w:tcW w:type="dxa" w:w="3120"/>
-            <w:shd w:val="clear" w:color="auto" w:fill="DCE6F0"/>
-          </w:tcPr>
-          <w:p>
-            <w:pPr>
-              <w:spacing w:after="0"/>
-            </w:pPr>
-            <w:r/>
-            <w:r>
-              <w:rPr>
-                <w:b/>
-                <w:sz w:val="19"/>
-              </w:rPr>
-              <w:t>Quantity</w:t>
-            </w:r>
-          </w:p>
-        </w:tc>
-        <w:tc>
-          <w:tcPr>
-            <w:tcW w:type="dxa" w:w="3120"/>
-            <w:shd w:val="clear" w:color="auto" w:fill="DCE6F0"/>
-          </w:tcPr>
-          <w:p>
-            <w:pPr>
-              <w:spacing w:after="0"/>
-            </w:pPr>
-            <w:r/>
-            <w:r>
-              <w:rPr>
-                <w:b/>
-                <w:sz w:val="19"/>
-              </w:rPr>
-              <w:t>Value</w:t>
-            </w:r>
-          </w:p>
-        </w:tc>
-        <w:tc>
-          <w:tcPr>
-            <w:tcW w:type="dxa" w:w="3120"/>
-            <w:shd w:val="clear" w:color="auto" w:fill="DCE6F0"/>
-          </w:tcPr>
-          <w:p>
-            <w:pPr>
-              <w:spacing w:after="0"/>
-            </w:pPr>
-            <w:r/>
-            <w:r>
-              <w:rPr>
-                <w:b/>
-                <w:sz w:val="19"/>
-              </w:rPr>
-              <w:t>Where it appears</w:t>
-            </w:r>
-          </w:p>
-        </w:tc>
-      </w:tr>
-      <w:tr>
-        <w:tc>
-          <w:tcPr>
-            <w:tcW w:type="dxa" w:w="3120"/>
-          </w:tcPr>
-          <w:p>
-            <w:pPr>
-              <w:spacing w:after="0"/>
-            </w:pPr>
-            <w:r/>
-            <w:r>
-              <w:rPr>
-                <w:sz w:val="19"/>
-              </w:rPr>
-              <w:t>Ordinary matter</w:t>
-            </w:r>
-          </w:p>
-        </w:tc>
-        <w:tc>
-          <w:tcPr>
-            <w:tcW w:type="dxa" w:w="3120"/>
-          </w:tcPr>
-          <w:p>
-            <w:pPr>
-              <w:spacing w:after="0"/>
-            </w:pPr>
-            <w:r/>
-            <w:r>
-              <w:rPr>
-                <w:sz w:val="19"/>
-              </w:rPr>
-              <w:t>about 5 percent</w:t>
-            </w:r>
-          </w:p>
-        </w:tc>
-        <w:tc>
-          <w:tcPr>
-            <w:tcW w:type="dxa" w:w="3120"/>
-          </w:tcPr>
-          <w:p>
-            <w:pPr>
-              <w:spacing w:after="0"/>
-            </w:pPr>
-            <w:r/>
-            <w:r>
-              <w:rPr>
-                <w:sz w:val="19"/>
-              </w:rPr>
-              <w:t>stars, gas, planets, people</w:t>
-            </w:r>
-          </w:p>
-        </w:tc>
-      </w:tr>
-      <w:tr>
-        <w:tc>
-          <w:tcPr>
-            <w:tcW w:type="dxa" w:w="3120"/>
-          </w:tcPr>
-          <w:p>
-            <w:pPr>
-              <w:spacing w:after="0"/>
-            </w:pPr>
-            <w:r/>
-            <w:r>
-              <w:rPr>
-                <w:sz w:val="19"/>
-              </w:rPr>
-              <w:t>Dark matter</w:t>
-            </w:r>
-          </w:p>
-        </w:tc>
-        <w:tc>
-          <w:tcPr>
-            <w:tcW w:type="dxa" w:w="3120"/>
-          </w:tcPr>
-          <w:p>
-            <w:pPr>
-              <w:spacing w:after="0"/>
-            </w:pPr>
-            <w:r/>
-            <w:r>
-              <w:rPr>
-                <w:sz w:val="19"/>
-              </w:rPr>
-              <w:t>about 27 percent</w:t>
-            </w:r>
-          </w:p>
-        </w:tc>
-        <w:tc>
-          <w:tcPr>
-            <w:tcW w:type="dxa" w:w="3120"/>
-          </w:tcPr>
-          <w:p>
-            <w:pPr>
-              <w:spacing w:after="0"/>
-            </w:pPr>
-            <w:r/>
-            <w:r>
-              <w:rPr>
-                <w:sz w:val="19"/>
-              </w:rPr>
-              <w:t>extra bend, no identified owner</w:t>
-            </w:r>
-          </w:p>
-        </w:tc>
-      </w:tr>
-      <w:tr>
-        <w:tc>
-          <w:tcPr>
-            <w:tcW w:type="dxa" w:w="3120"/>
-          </w:tcPr>
-          <w:p>
-            <w:pPr>
-              <w:spacing w:after="0"/>
-            </w:pPr>
-            <w:r/>
-            <w:r>
-              <w:rPr>
-                <w:sz w:val="19"/>
-              </w:rPr>
-              <w:t>Dark energy</w:t>
-            </w:r>
-          </w:p>
-        </w:tc>
-        <w:tc>
-          <w:tcPr>
-            <w:tcW w:type="dxa" w:w="3120"/>
-          </w:tcPr>
-          <w:p>
-            <w:pPr>
-              <w:spacing w:after="0"/>
-            </w:pPr>
-            <w:r/>
-            <w:r>
-              <w:rPr>
-                <w:sz w:val="19"/>
-              </w:rPr>
-              <w:t>about 68 percent</w:t>
-            </w:r>
-          </w:p>
-        </w:tc>
-        <w:tc>
-          <w:tcPr>
-            <w:tcW w:type="dxa" w:w="3120"/>
-          </w:tcPr>
-          <w:p>
-            <w:pPr>
-              <w:spacing w:after="0"/>
-            </w:pPr>
-            <w:r/>
-            <w:r>
-              <w:rPr>
-                <w:sz w:val="19"/>
-              </w:rPr>
-              <w:t>the label on the speedup</w:t>
-            </w:r>
-          </w:p>
-        </w:tc>
-      </w:tr>
-      <w:tr>
-        <w:tc>
-          <w:tcPr>
-            <w:tcW w:type="dxa" w:w="3120"/>
-          </w:tcPr>
-          <w:p>
-            <w:pPr>
-              <w:spacing w:after="0"/>
-            </w:pPr>
-            <w:r/>
-            <w:r>
-              <w:rPr>
-                <w:sz w:val="19"/>
-              </w:rPr>
-              <w:t>Microwave glow today</w:t>
-            </w:r>
-          </w:p>
-        </w:tc>
-        <w:tc>
-          <w:tcPr>
-            <w:tcW w:type="dxa" w:w="3120"/>
-          </w:tcPr>
-          <w:p>
-            <w:pPr>
-              <w:spacing w:after="0"/>
-            </w:pPr>
-            <w:r/>
-            <w:r>
-              <w:rPr>
-                <w:sz w:val="19"/>
-              </w:rPr>
-              <w:t>2.725 K</w:t>
-            </w:r>
-          </w:p>
-        </w:tc>
-        <w:tc>
-          <w:tcPr>
-            <w:tcW w:type="dxa" w:w="3120"/>
-          </w:tcPr>
-          <w:p>
-            <w:pPr>
-              <w:spacing w:after="0"/>
-            </w:pPr>
-            <w:r/>
-            <w:r>
-              <w:rPr>
-                <w:sz w:val="19"/>
-              </w:rPr>
-              <w:t>the cooled early light</w:t>
-            </w:r>
-          </w:p>
-        </w:tc>
-      </w:tr>
-      <w:tr>
-        <w:tc>
-          <w:tcPr>
-            <w:tcW w:type="dxa" w:w="3120"/>
-          </w:tcPr>
-          <w:p>
-            <w:pPr>
-              <w:spacing w:after="0"/>
-            </w:pPr>
-            <w:r/>
-            <w:r>
-              <w:rPr>
-                <w:sz w:val="19"/>
-              </w:rPr>
-              <w:t>Smoothness of the glow</w:t>
-            </w:r>
-          </w:p>
-        </w:tc>
-        <w:tc>
-          <w:tcPr>
-            <w:tcW w:type="dxa" w:w="3120"/>
-          </w:tcPr>
-          <w:p>
-            <w:pPr>
-              <w:spacing w:after="0"/>
-            </w:pPr>
-            <w:r/>
-            <w:r>
-              <w:rPr>
-                <w:sz w:val="19"/>
-              </w:rPr>
-              <w:t>1 part in 100,000</w:t>
-            </w:r>
-          </w:p>
-        </w:tc>
-        <w:tc>
-          <w:tcPr>
-            <w:tcW w:type="dxa" w:w="3120"/>
-          </w:tcPr>
-          <w:p>
-            <w:pPr>
-              <w:spacing w:after="0"/>
-            </w:pPr>
-            <w:r/>
-            <w:r>
-              <w:rPr>
-                <w:sz w:val="19"/>
-              </w:rPr>
-              <w:t>the seeds of galaxies</w:t>
-            </w:r>
-          </w:p>
-        </w:tc>
-      </w:tr>
-      <w:tr>
-        <w:tc>
-          <w:tcPr>
-            <w:tcW w:type="dxa" w:w="3120"/>
-          </w:tcPr>
-          <w:p>
-            <w:pPr>
-              <w:spacing w:after="0"/>
-            </w:pPr>
-            <w:r/>
-            <w:r>
-              <w:rPr>
-                <w:sz w:val="19"/>
-              </w:rPr>
-              <w:t>Andromeda</w:t>
-            </w:r>
-          </w:p>
-        </w:tc>
-        <w:tc>
-          <w:tcPr>
-            <w:tcW w:type="dxa" w:w="3120"/>
-          </w:tcPr>
-          <w:p>
-            <w:pPr>
-              <w:spacing w:after="0"/>
-            </w:pPr>
-            <w:r/>
-            <w:r>
-              <w:rPr>
-                <w:sz w:val="19"/>
-              </w:rPr>
-              <w:t>about 2.5 million light-years, approaching at about 110 km/s</w:t>
-            </w:r>
-          </w:p>
-        </w:tc>
-        <w:tc>
-          <w:tcPr>
-            <w:tcW w:type="dxa" w:w="3120"/>
-          </w:tcPr>
-          <w:p>
-            <w:pPr>
-              <w:spacing w:after="0"/>
-            </w:pPr>
-            <w:r/>
-            <w:r>
-              <w:rPr>
-                <w:sz w:val="19"/>
-              </w:rPr>
-              <w:t>local pull beating the stretch</w:t>
-            </w:r>
-          </w:p>
-        </w:tc>
-      </w:tr>
-      <w:tr>
-        <w:tc>
-          <w:tcPr>
-            <w:tcW w:type="dxa" w:w="3120"/>
-          </w:tcPr>
-          <w:p>
-            <w:pPr>
-              <w:spacing w:after="0"/>
-            </w:pPr>
-            <w:r/>
-            <w:r>
-              <w:rPr>
-                <w:sz w:val="19"/>
-              </w:rPr>
-              <w:t>Moon’s retreat</w:t>
-            </w:r>
-          </w:p>
-        </w:tc>
-        <w:tc>
-          <w:tcPr>
-            <w:tcW w:type="dxa" w:w="3120"/>
-          </w:tcPr>
-          <w:p>
-            <w:pPr>
-              <w:spacing w:after="0"/>
-            </w:pPr>
-            <w:r/>
-            <w:r>
-              <w:rPr>
-                <w:sz w:val="19"/>
-              </w:rPr>
-              <w:t>about 3.8 cm a year</w:t>
-            </w:r>
-          </w:p>
-        </w:tc>
-        <w:tc>
-          <w:tcPr>
-            <w:tcW w:type="dxa" w:w="3120"/>
-          </w:tcPr>
-          <w:p>
-            <w:pPr>
-              <w:spacing w:after="0"/>
-            </w:pPr>
-            <w:r/>
-            <w:r>
-              <w:rPr>
-                <w:sz w:val="19"/>
-              </w:rPr>
-              <w:t>the tide’s other bill</w:t>
-            </w:r>
-          </w:p>
-        </w:tc>
-      </w:tr>
-    </w:tbl>
+    <w:p>
+      <w:pPr>
+        <w:spacing w:before="0" w:after="100"/>
+      </w:pPr>
+      <w:r>
+        <w:rPr>
+          <w:b/>
+        </w:rPr>
+      </w:r>
+      <w:r>
+        <w:rPr>
+          <w:b/>
+          <w:sz w:val="19"/>
+        </w:rPr>
+        <w:t>Quantity</w:t>
+      </w:r>
+      <w:r>
+        <w:rPr>
+          <w:b/>
+        </w:rPr>
+        <w:t xml:space="preserve"> — </w:t>
+      </w:r>
+      <w:r>
+        <w:rPr>
+          <w:b/>
+        </w:rPr>
+      </w:r>
+      <w:r>
+        <w:rPr>
+          <w:b/>
+          <w:sz w:val="19"/>
+        </w:rPr>
+        <w:t>Value</w:t>
+      </w:r>
+      <w:r>
+        <w:rPr>
+          <w:b/>
+        </w:rPr>
+        <w:t xml:space="preserve"> — </w:t>
+      </w:r>
+      <w:r>
+        <w:rPr>
+          <w:b/>
+        </w:rPr>
+      </w:r>
+      <w:r>
+        <w:rPr>
+          <w:b/>
+          <w:sz w:val="19"/>
+        </w:rPr>
+        <w:t>Where it appears</w:t>
+      </w:r>
+    </w:p>
+    <w:p>
+      <w:pPr>
+        <w:spacing w:before="0" w:after="100"/>
+      </w:pPr>
+      <w:r>
+        <w:rPr>
+          <w:b/>
+        </w:rPr>
+      </w:r>
+      <w:r>
+        <w:rPr>
+          <w:b/>
+          <w:sz w:val="19"/>
+        </w:rPr>
+        <w:t>Ordinary matter</w:t>
+      </w:r>
+      <w:r>
+        <w:br/>
+      </w:r>
+      <w:r>
+        <w:rPr>
+          <w:i/>
+        </w:rPr>
+        <w:t xml:space="preserve">Value: </w:t>
+      </w:r>
+      <w:r>
+        <w:rPr/>
+      </w:r>
+      <w:r>
+        <w:rPr>
+          <w:sz w:val="19"/>
+        </w:rPr>
+        <w:t>about 5 percent</w:t>
+      </w:r>
+      <w:r>
+        <w:br/>
+      </w:r>
+      <w:r>
+        <w:rPr>
+          <w:i/>
+        </w:rPr>
+        <w:t xml:space="preserve">Where it appears: </w:t>
+      </w:r>
+      <w:r>
+        <w:rPr/>
+      </w:r>
+      <w:r>
+        <w:rPr>
+          <w:sz w:val="19"/>
+        </w:rPr>
+        <w:t>stars, gas, planets, people</w:t>
+      </w:r>
+    </w:p>
+    <w:p>
+      <w:pPr>
+        <w:spacing w:before="0" w:after="100"/>
+      </w:pPr>
+      <w:r>
+        <w:rPr>
+          <w:b/>
+        </w:rPr>
+      </w:r>
+      <w:r>
+        <w:rPr>
+          <w:b/>
+          <w:sz w:val="19"/>
+        </w:rPr>
+        <w:t>Dark matter</w:t>
+      </w:r>
+      <w:r>
+        <w:br/>
+      </w:r>
+      <w:r>
+        <w:rPr>
+          <w:i/>
+        </w:rPr>
+        <w:t xml:space="preserve">Value: </w:t>
+      </w:r>
+      <w:r>
+        <w:rPr/>
+      </w:r>
+      <w:r>
+        <w:rPr>
+          <w:sz w:val="19"/>
+        </w:rPr>
+        <w:t>about 27 percent</w:t>
+      </w:r>
+      <w:r>
+        <w:br/>
+      </w:r>
+      <w:r>
+        <w:rPr>
+          <w:i/>
+        </w:rPr>
+        <w:t xml:space="preserve">Where it appears: </w:t>
+      </w:r>
+      <w:r>
+        <w:rPr/>
+      </w:r>
+      <w:r>
+        <w:rPr>
+          <w:sz w:val="19"/>
+        </w:rPr>
+        <w:t>extra bend, no identified owner</w:t>
+      </w:r>
+    </w:p>
+    <w:p>
+      <w:pPr>
+        <w:spacing w:before="0" w:after="100"/>
+      </w:pPr>
+      <w:r>
+        <w:rPr>
+          <w:b/>
+        </w:rPr>
+      </w:r>
+      <w:r>
+        <w:rPr>
+          <w:b/>
+          <w:sz w:val="19"/>
+        </w:rPr>
+        <w:t>Dark energy</w:t>
+      </w:r>
+      <w:r>
+        <w:br/>
+      </w:r>
+      <w:r>
+        <w:rPr>
+          <w:i/>
+        </w:rPr>
+        <w:t xml:space="preserve">Value: </w:t>
+      </w:r>
+      <w:r>
+        <w:rPr/>
+      </w:r>
+      <w:r>
+        <w:rPr>
+          <w:sz w:val="19"/>
+        </w:rPr>
+        <w:t>about 68 percent</w:t>
+      </w:r>
+      <w:r>
+        <w:br/>
+      </w:r>
+      <w:r>
+        <w:rPr>
+          <w:i/>
+        </w:rPr>
+        <w:t xml:space="preserve">Where it appears: </w:t>
+      </w:r>
+      <w:r>
+        <w:rPr/>
+      </w:r>
+      <w:r>
+        <w:rPr>
+          <w:sz w:val="19"/>
+        </w:rPr>
+        <w:t>the label on the speedup</w:t>
+      </w:r>
+    </w:p>
+    <w:p>
+      <w:pPr>
+        <w:spacing w:before="0" w:after="100"/>
+      </w:pPr>
+      <w:r>
+        <w:rPr>
+          <w:b/>
+        </w:rPr>
+      </w:r>
+      <w:r>
+        <w:rPr>
+          <w:b/>
+          <w:sz w:val="19"/>
+        </w:rPr>
+        <w:t>Microwave glow today</w:t>
+      </w:r>
+      <w:r>
+        <w:br/>
+      </w:r>
+      <w:r>
+        <w:rPr>
+          <w:i/>
+        </w:rPr>
+        <w:t xml:space="preserve">Value: </w:t>
+      </w:r>
+      <w:r>
+        <w:rPr/>
+      </w:r>
+      <w:r>
+        <w:rPr>
+          <w:sz w:val="19"/>
+        </w:rPr>
+        <w:t>2.725 K</w:t>
+      </w:r>
+      <w:r>
+        <w:br/>
+      </w:r>
+      <w:r>
+        <w:rPr>
+          <w:i/>
+        </w:rPr>
+        <w:t xml:space="preserve">Where it appears: </w:t>
+      </w:r>
+      <w:r>
+        <w:rPr/>
+      </w:r>
+      <w:r>
+        <w:rPr>
+          <w:sz w:val="19"/>
+        </w:rPr>
+        <w:t>the cooled early light</w:t>
+      </w:r>
+    </w:p>
+    <w:p>
+      <w:pPr>
+        <w:spacing w:before="0" w:after="100"/>
+      </w:pPr>
+      <w:r>
+        <w:rPr>
+          <w:b/>
+        </w:rPr>
+      </w:r>
+      <w:r>
+        <w:rPr>
+          <w:b/>
+          <w:sz w:val="19"/>
+        </w:rPr>
+        <w:t>Smoothness of the glow</w:t>
+      </w:r>
+      <w:r>
+        <w:br/>
+      </w:r>
+      <w:r>
+        <w:rPr>
+          <w:i/>
+        </w:rPr>
+        <w:t xml:space="preserve">Value: </w:t>
+      </w:r>
+      <w:r>
+        <w:rPr/>
+      </w:r>
+      <w:r>
+        <w:rPr>
+          <w:sz w:val="19"/>
+        </w:rPr>
+        <w:t>1 part in 100,000</w:t>
+      </w:r>
+      <w:r>
+        <w:br/>
+      </w:r>
+      <w:r>
+        <w:rPr>
+          <w:i/>
+        </w:rPr>
+        <w:t xml:space="preserve">Where it appears: </w:t>
+      </w:r>
+      <w:r>
+        <w:rPr/>
+      </w:r>
+      <w:r>
+        <w:rPr>
+          <w:sz w:val="19"/>
+        </w:rPr>
+        <w:t>the seeds of galaxies</w:t>
+      </w:r>
+    </w:p>
+    <w:p>
+      <w:pPr>
+        <w:spacing w:before="0" w:after="100"/>
+      </w:pPr>
+      <w:r>
+        <w:rPr>
+          <w:b/>
+        </w:rPr>
+      </w:r>
+      <w:r>
+        <w:rPr>
+          <w:b/>
+          <w:sz w:val="19"/>
+        </w:rPr>
+        <w:t>Andromeda</w:t>
+      </w:r>
+      <w:r>
+        <w:br/>
+      </w:r>
+      <w:r>
+        <w:rPr>
+          <w:i/>
+        </w:rPr>
+        <w:t xml:space="preserve">Value: </w:t>
+      </w:r>
+      <w:r>
+        <w:rPr/>
+      </w:r>
+      <w:r>
+        <w:rPr>
+          <w:sz w:val="19"/>
+        </w:rPr>
+        <w:t>about 2.5 million light-years, approaching at about 110 km/s</w:t>
+      </w:r>
+      <w:r>
+        <w:br/>
+      </w:r>
+      <w:r>
+        <w:rPr>
+          <w:i/>
+        </w:rPr>
+        <w:t xml:space="preserve">Where it appears: </w:t>
+      </w:r>
+      <w:r>
+        <w:rPr/>
+      </w:r>
+      <w:r>
+        <w:rPr>
+          <w:sz w:val="19"/>
+        </w:rPr>
+        <w:t>local pull beating the stretch</w:t>
+      </w:r>
+    </w:p>
+    <w:p>
+      <w:pPr>
+        <w:spacing w:before="0" w:after="100"/>
+      </w:pPr>
+      <w:r>
+        <w:rPr>
+          <w:b/>
+        </w:rPr>
+      </w:r>
+      <w:r>
+        <w:rPr>
+          <w:b/>
+          <w:sz w:val="19"/>
+        </w:rPr>
+        <w:t>Moon’s retreat</w:t>
+      </w:r>
+      <w:r>
+        <w:br/>
+      </w:r>
+      <w:r>
+        <w:rPr>
+          <w:i/>
+        </w:rPr>
+        <w:t xml:space="preserve">Value: </w:t>
+      </w:r>
+      <w:r>
+        <w:rPr/>
+      </w:r>
+      <w:r>
+        <w:rPr>
+          <w:sz w:val="19"/>
+        </w:rPr>
+        <w:t>about 3.8 cm a year</w:t>
+      </w:r>
+      <w:r>
+        <w:br/>
+      </w:r>
+      <w:r>
+        <w:rPr>
+          <w:i/>
+        </w:rPr>
+        <w:t xml:space="preserve">Where it appears: </w:t>
+      </w:r>
+      <w:r>
+        <w:rPr/>
+      </w:r>
+      <w:r>
+        <w:rPr>
+          <w:sz w:val="19"/>
+        </w:rPr>
+        <w:t>the tide’s other bill</w:t>
+      </w:r>
+    </w:p>
     <w:p/>
     <w:p>
       <w:pPr>

</xml_diff>